<commit_message>
docs: add Credits section to user manual
Co-Authored-By: Claude Sonnet 4.6 <noreply@anthropic.com>
</commit_message>
<xml_diff>
--- a/dicomtool-manual.docx
+++ b/dicomtool-manual.docx
@@ -9936,6 +9936,288 @@
       </w:pPr>
       <w:r>
         <w:t xml:space="preserve">}</w:t>
+      </w:r>
+    </w:p>
+    <w:p>
+      <w:r>
+        <w:br w:type="page"/>
+      </w:r>
+    </w:p>
+    <w:p>
+      <w:pPr>
+        <w:pStyle w:val="Heading1"/>
+      </w:pPr>
+      <w:r>
+        <w:t>Credits</w:t>
+      </w:r>
+    </w:p>
+    <w:p>
+      <w:pPr>
+        <w:pStyle w:val="Heading2"/>
+      </w:pPr>
+      <w:r>
+        <w:t>Developer</w:t>
+      </w:r>
+    </w:p>
+    <w:p>
+      <w:r>
+        <w:t xml:space="preserve">Jeffrey Leal</w:t>
+      </w:r>
+    </w:p>
+    <w:p>
+      <w:r>
+        <w:t xml:space="preserve">Email: jeffrey.leal@gmail.com</w:t>
+      </w:r>
+    </w:p>
+    <w:p>
+      <w:r>
+        <w:t xml:space="preserve">GitHub: https://github.com/jeffrey-leal</w:t>
+      </w:r>
+    </w:p>
+    <w:p>
+      <w:pPr>
+        <w:pStyle w:val="Heading2"/>
+      </w:pPr>
+      <w:r>
+        <w:t>AI Assistance</w:t>
+      </w:r>
+    </w:p>
+    <w:p>
+      <w:r>
+        <w:t xml:space="preserve">This application was designed and developed with the assistance of Claude Sonnet 4.6 by Anthropic, accessed through Claude Code (https://claude.ai/code).</w:t>
+      </w:r>
+    </w:p>
+    <w:p>
+      <w:r>
+        <w:t xml:space="preserve">Contributions made with AI assistance include:</w:t>
+      </w:r>
+    </w:p>
+    <w:p>
+      <w:pPr>
+        <w:pStyle w:val="ListBullet"/>
+      </w:pPr>
+      <w:r>
+        <w:t xml:space="preserve">Application architecture and Go source code</w:t>
+      </w:r>
+    </w:p>
+    <w:p>
+      <w:pPr>
+        <w:pStyle w:val="ListBullet"/>
+      </w:pPr>
+      <w:r>
+        <w:t xml:space="preserve">Cobra CLI framework integration and command structure</w:t>
+      </w:r>
+    </w:p>
+    <w:p>
+      <w:pPr>
+        <w:pStyle w:val="ListBullet"/>
+      </w:pPr>
+      <w:r>
+        <w:t xml:space="preserve">DICOM tag inspection, modification, and VR correction logic</w:t>
+      </w:r>
+    </w:p>
+    <w:p>
+      <w:pPr>
+        <w:pStyle w:val="ListBullet"/>
+      </w:pPr>
+      <w:r>
+        <w:t xml:space="preserve">Profile system design and de-identification workflow</w:t>
+      </w:r>
+    </w:p>
+    <w:p>
+      <w:pPr>
+        <w:pStyle w:val="ListBullet"/>
+      </w:pPr>
+      <w:r>
+        <w:t xml:space="preserve">Tag alias and default configuration file content</w:t>
+      </w:r>
+    </w:p>
+    <w:p>
+      <w:pPr>
+        <w:pStyle w:val="ListBullet"/>
+      </w:pPr>
+      <w:r>
+        <w:t xml:space="preserve">Build scripts and cross-compilation configuration</w:t>
+      </w:r>
+    </w:p>
+    <w:p>
+      <w:pPr>
+        <w:pStyle w:val="ListBullet"/>
+      </w:pPr>
+      <w:r>
+        <w:t xml:space="preserve">User manual, changelog, and project documentation</w:t>
+      </w:r>
+    </w:p>
+    <w:p>
+      <w:pPr>
+        <w:pStyle w:val="Heading2"/>
+      </w:pPr>
+      <w:r>
+        <w:t>DICOM Standard Reference</w:t>
+      </w:r>
+    </w:p>
+    <w:p>
+      <w:r>
+        <w:t xml:space="preserve">Protocol implementation and data dictionary usage follow the DICOM Standard published by NEMA:</w:t>
+      </w:r>
+    </w:p>
+    <w:p>
+      <w:r>
+        <w:t xml:space="preserve">DICOM PS3 (2024b) — https://dicom.nema.org/medical/dicom/current</w:t>
+      </w:r>
+    </w:p>
+    <w:p>
+      <w:pPr>
+        <w:pStyle w:val="Heading2"/>
+      </w:pPr>
+      <w:r>
+        <w:t>Open-Source Libraries</w:t>
+      </w:r>
+    </w:p>
+    <w:tbl>
+      <w:tblPr>
+        <w:tblW w:w="0" w:type="auto"/>
+        <w:tblBorders>
+          <w:top w:val="single" w:sz="4" w:space="0" w:color="BBBBBB"/>
+          <w:left w:val="single" w:sz="4" w:space="0" w:color="BBBBBB"/>
+          <w:bottom w:val="single" w:sz="4" w:space="0" w:color="BBBBBB"/>
+          <w:right w:val="single" w:sz="4" w:space="0" w:color="BBBBBB"/>
+          <w:insideH w:val="single" w:sz="4" w:space="0" w:color="BBBBBB"/>
+          <w:insideV w:val="single" w:sz="4" w:space="0" w:color="BBBBBB"/>
+        </w:tblBorders>
+        <w:tblCellMar>
+          <w:top w:w="80" w:type="dxa"/>
+          <w:left w:w="140" w:type="dxa"/>
+          <w:bottom w:w="80" w:type="dxa"/>
+          <w:right w:w="140" w:type="dxa"/>
+        </w:tblCellMar>
+      </w:tblPr>
+      <w:tblGrid>
+        <w:gridCol w:w="2700"/>
+        <w:gridCol w:w="6300"/>
+      </w:tblGrid>
+      <w:tr>
+        <w:tc>
+          <w:tcPr>
+            <w:tcW w:w="2700" w:type="dxa"/>
+            <w:shd w:val="clear" w:color="auto" w:fill="2E74B5"/>
+          </w:tcPr>
+          <w:p>
+            <w:r>
+              <w:rPr>
+                <w:b/>
+                <w:color w:val="FFFFFF"/>
+                <w:sz w:val="20"/>
+                <w:szCs w:val="20"/>
+              </w:rPr>
+              <w:t xml:space="preserve">Library</w:t>
+            </w:r>
+          </w:p>
+        </w:tc>
+        <w:tc>
+          <w:tcPr>
+            <w:tcW w:w="6300" w:type="dxa"/>
+            <w:shd w:val="clear" w:color="auto" w:fill="2E74B5"/>
+          </w:tcPr>
+          <w:p>
+            <w:r>
+              <w:rPr>
+                <w:b/>
+                <w:color w:val="FFFFFF"/>
+                <w:sz w:val="20"/>
+                <w:szCs w:val="20"/>
+              </w:rPr>
+              <w:t xml:space="preserve">Purpose</w:t>
+            </w:r>
+          </w:p>
+        </w:tc>
+      </w:tr>
+      <w:tr>
+        <w:tc>
+          <w:tcPr>
+            <w:tcW w:w="2700" w:type="dxa"/>
+          </w:tcPr>
+          <w:p>
+            <w:r>
+              <w:rPr>
+                <w:rFonts w:ascii="Courier New" w:hAnsi="Courier New"/>
+                <w:sz w:val="18"/>
+                <w:szCs w:val="18"/>
+                <w:shd w:val="clear" w:color="auto" w:fill="EBEBEB"/>
+              </w:rPr>
+              <w:t xml:space="preserve">github.com/spf13/cobra</w:t>
+            </w:r>
+            <w:r>
+              <w:t xml:space="preserve"> v1.10.2</w:t>
+            </w:r>
+          </w:p>
+        </w:tc>
+        <w:tc>
+          <w:tcPr>
+            <w:tcW w:w="6300" w:type="dxa"/>
+          </w:tcPr>
+          <w:p>
+            <w:r>
+              <w:t xml:space="preserve">CLI framework — command routing, flag parsing, help generation</w:t>
+            </w:r>
+          </w:p>
+        </w:tc>
+      </w:tr>
+      <w:tr>
+        <w:tc>
+          <w:tcPr>
+            <w:tcW w:w="2700" w:type="dxa"/>
+            <w:shd w:val="clear" w:color="auto" w:fill="F5F5F5"/>
+          </w:tcPr>
+          <w:p>
+            <w:r>
+              <w:rPr>
+                <w:rFonts w:ascii="Courier New" w:hAnsi="Courier New"/>
+                <w:sz w:val="18"/>
+                <w:szCs w:val="18"/>
+                <w:shd w:val="clear" w:color="auto" w:fill="EBEBEB"/>
+              </w:rPr>
+              <w:t xml:space="preserve">github.com/suyashkumar/dicom</w:t>
+            </w:r>
+            <w:r>
+              <w:t xml:space="preserve"> v1.1.0</w:t>
+            </w:r>
+          </w:p>
+        </w:tc>
+        <w:tc>
+          <w:tcPr>
+            <w:tcW w:w="6300" w:type="dxa"/>
+            <w:shd w:val="clear" w:color="auto" w:fill="F5F5F5"/>
+          </w:tcPr>
+          <w:p>
+            <w:r>
+              <w:t xml:space="preserve">DICOM file parsing, data dictionary, and element model</w:t>
+            </w:r>
+          </w:p>
+        </w:tc>
+      </w:tr>
+    </w:tbl>
+    <w:p/>
+    <w:p>
+      <w:pPr>
+        <w:spacing w:after="0"/>
+      </w:pPr>
+    </w:p>
+    <w:p>
+      <w:r>
+        <w:t xml:space="preserve">A full list of all transitive dependencies and their versions is recorded in </w:t>
+      </w:r>
+      <w:r>
+        <w:rPr>
+          <w:rFonts w:ascii="Courier New" w:hAnsi="Courier New"/>
+          <w:sz w:val="18"/>
+          <w:szCs w:val="18"/>
+          <w:shd w:val="clear" w:color="auto" w:fill="EBEBEB"/>
+        </w:rPr>
+        <w:t xml:space="preserve">go.sum</w:t>
+      </w:r>
+      <w:r>
+        <w:t xml:space="preserve">.</w:t>
       </w:r>
     </w:p>
     <w:sectPr>

</xml_diff>

<commit_message>
Release v1.2.0: per-modality profile overrides
Add per-modality, keep, and keepprivate profile fields so a single
profile can apply different modifications depending on each file's
DICOM Modality tag. Also fix stale convert references in test suite.

Co-Authored-By: Claude Sonnet 4.6 <noreply@anthropic.com>
</commit_message>
<xml_diff>
--- a/dicomtool-manual.docx
+++ b/dicomtool-manual.docx
@@ -30,7 +30,7 @@
         <w:pStyle w:val="DocSubtitle"/>
       </w:pPr>
       <w:r>
-        <w:t>Usage Manual  v1.1.4</w:t>
+        <w:t>Usage Manual  v1.2.0</w:t>
       </w:r>
     </w:p>
     <w:p>
@@ -4137,6 +4137,14 @@
         <w:pStyle w:val="Code"/>
       </w:pPr>
       <w:r>
+        <w:t xml:space="preserve">    "keep":           [],</w:t>
+      </w:r>
+    </w:p>
+    <w:p>
+      <w:pPr>
+        <w:pStyle w:val="Code"/>
+      </w:pPr>
+      <w:r>
         <w:t xml:space="preserve">    "dob":            "YYYY0101",</w:t>
       </w:r>
     </w:p>
@@ -4161,6 +4169,14 @@
         <w:pStyle w:val="Code"/>
       </w:pPr>
       <w:r>
+        <w:t xml:space="preserve">    "keepprivate":    false,</w:t>
+      </w:r>
+    </w:p>
+    <w:p>
+      <w:pPr>
+        <w:pStyle w:val="Code"/>
+      </w:pPr>
+      <w:r>
         <w:t xml:space="preserve">    "maskrows":       0,</w:t>
       </w:r>
     </w:p>
@@ -4201,7 +4217,15 @@
         <w:pStyle w:val="Code"/>
       </w:pPr>
       <w:r>
-        <w:t xml:space="preserve">    "verbose":        false</w:t>
+        <w:t xml:space="preserve">    "verbose":        false,</w:t>
+      </w:r>
+    </w:p>
+    <w:p>
+      <w:pPr>
+        <w:pStyle w:val="Code"/>
+      </w:pPr>
+      <w:r>
+        <w:t xml:space="preserve">    "per-modality":   {}</w:t>
       </w:r>
     </w:p>
     <w:p>
@@ -4223,6 +4247,59 @@
     <w:p>
       <w:r>
         <w:t xml:space="preserve">All fields are optional. Omitted fields take their command-line defaults.</w:t>
+      </w:r>
+    </w:p>
+    <w:p>
+      <w:r>
+        <w:t xml:space="preserve">The </w:t>
+      </w:r>
+      <w:r>
+        <w:rPr>
+          <w:rFonts w:ascii="Courier New" w:hAnsi="Courier New"/>
+          <w:sz w:val="18"/>
+          <w:szCs w:val="18"/>
+          <w:shd w:val="clear" w:color="auto" w:fill="EBEBEB"/>
+        </w:rPr>
+        <w:t xml:space="preserve">keep</w:t>
+      </w:r>
+      <w:r>
+        <w:t xml:space="preserve"> field lists tags that are excluded from the removal list. The </w:t>
+      </w:r>
+      <w:r>
+        <w:rPr>
+          <w:rFonts w:ascii="Courier New" w:hAnsi="Courier New"/>
+          <w:sz w:val="18"/>
+          <w:szCs w:val="18"/>
+          <w:shd w:val="clear" w:color="auto" w:fill="EBEBEB"/>
+        </w:rPr>
+        <w:t xml:space="preserve">keepprivate</w:t>
+      </w:r>
+      <w:r>
+        <w:t xml:space="preserve"> field suppresses </w:t>
+      </w:r>
+      <w:r>
+        <w:rPr>
+          <w:rFonts w:ascii="Courier New" w:hAnsi="Courier New"/>
+          <w:sz w:val="18"/>
+          <w:szCs w:val="18"/>
+          <w:shd w:val="clear" w:color="auto" w:fill="EBEBEB"/>
+        </w:rPr>
+        <w:t xml:space="preserve">noprivate</w:t>
+      </w:r>
+      <w:r>
+        <w:t xml:space="preserve"> for files processed by this profile. The </w:t>
+      </w:r>
+      <w:r>
+        <w:rPr>
+          <w:rFonts w:ascii="Courier New" w:hAnsi="Courier New"/>
+          <w:sz w:val="18"/>
+          <w:szCs w:val="18"/>
+          <w:shd w:val="clear" w:color="auto" w:fill="EBEBEB"/>
+        </w:rPr>
+        <w:t xml:space="preserve">per-modality</w:t>
+      </w:r>
+      <w:r>
+        <w:t xml:space="preserve"> field maps DICOM Modality values to override settings applied only to files of that modality (see Section 6.7).</w:t>
       </w:r>
     </w:p>
     <w:p>
@@ -4898,6 +4975,18 @@
               </w:rPr>
               <w:t xml:space="preserve">verbose</w:t>
             </w:r>
+            <w:r>
+              <w:t xml:space="preserve">, </w:t>
+            </w:r>
+            <w:r>
+              <w:rPr>
+                <w:rFonts w:ascii="Courier New" w:hAnsi="Courier New"/>
+                <w:sz w:val="18"/>
+                <w:szCs w:val="18"/>
+                <w:shd w:val="clear" w:color="auto" w:fill="EBEBEB"/>
+              </w:rPr>
+              <w:t xml:space="preserve">keepprivate</w:t>
+            </w:r>
           </w:p>
         </w:tc>
         <w:tc>
@@ -4983,6 +5072,59 @@
                 <w:szCs w:val="18"/>
                 <w:shd w:val="clear" w:color="auto" w:fill="EBEBEB"/>
               </w:rPr>
+              <w:t xml:space="preserve">keep</w:t>
+            </w:r>
+          </w:p>
+        </w:tc>
+        <w:tc>
+          <w:tcPr>
+            <w:tcW w:w="6300" w:type="dxa"/>
+            <w:shd w:val="clear" w:color="auto" w:fill="F5F5F5"/>
+          </w:tcPr>
+          <w:p>
+            <w:r>
+              <w:t xml:space="preserve">Tags listed in the derived profile's </w:t>
+            </w:r>
+            <w:r>
+              <w:rPr>
+                <w:rFonts w:ascii="Courier New" w:hAnsi="Courier New"/>
+                <w:sz w:val="18"/>
+                <w:szCs w:val="18"/>
+                <w:shd w:val="clear" w:color="auto" w:fill="EBEBEB"/>
+              </w:rPr>
+              <w:t xml:space="preserve">keep</w:t>
+            </w:r>
+            <w:r>
+              <w:t xml:space="preserve"> list are removed from the merged </w:t>
+            </w:r>
+            <w:r>
+              <w:rPr>
+                <w:rFonts w:ascii="Courier New" w:hAnsi="Courier New"/>
+                <w:sz w:val="18"/>
+                <w:szCs w:val="18"/>
+                <w:shd w:val="clear" w:color="auto" w:fill="EBEBEB"/>
+              </w:rPr>
+              <w:t xml:space="preserve">remove</w:t>
+            </w:r>
+            <w:r>
+              <w:t xml:space="preserve"> list. A derived profile can restore tags that a parent removes.</w:t>
+            </w:r>
+          </w:p>
+        </w:tc>
+      </w:tr>
+      <w:tr>
+        <w:tc>
+          <w:tcPr>
+            <w:tcW w:w="2700" w:type="dxa"/>
+          </w:tcPr>
+          <w:p>
+            <w:r>
+              <w:rPr>
+                <w:rFonts w:ascii="Courier New" w:hAnsi="Courier New"/>
+                <w:sz w:val="18"/>
+                <w:szCs w:val="18"/>
+                <w:shd w:val="clear" w:color="auto" w:fill="EBEBEB"/>
+              </w:rPr>
               <w:t xml:space="preserve">ignoretype</w:t>
             </w:r>
             <w:r>
@@ -5002,22 +5144,22 @@
         <w:tc>
           <w:tcPr>
             <w:tcW w:w="6300" w:type="dxa"/>
+          </w:tcPr>
+          <w:p>
+            <w:r>
+              <w:t xml:space="preserve">Union of both lists, deduplicated (case-insensitive).</w:t>
+            </w:r>
+          </w:p>
+        </w:tc>
+      </w:tr>
+      <w:tr>
+        <w:tc>
+          <w:tcPr>
+            <w:tcW w:w="2700" w:type="dxa"/>
             <w:shd w:val="clear" w:color="auto" w:fill="F5F5F5"/>
           </w:tcPr>
           <w:p>
             <w:r>
-              <w:t xml:space="preserve">Union of both lists, deduplicated (case-insensitive).</w:t>
-            </w:r>
-          </w:p>
-        </w:tc>
-      </w:tr>
-      <w:tr>
-        <w:tc>
-          <w:tcPr>
-            <w:tcW w:w="2700" w:type="dxa"/>
-          </w:tcPr>
-          <w:p>
-            <w:r>
               <w:rPr>
                 <w:rFonts w:ascii="Courier New" w:hAnsi="Courier New"/>
                 <w:sz w:val="18"/>
@@ -5031,10 +5173,39 @@
         <w:tc>
           <w:tcPr>
             <w:tcW w:w="6300" w:type="dxa"/>
+            <w:shd w:val="clear" w:color="auto" w:fill="F5F5F5"/>
           </w:tcPr>
           <w:p>
             <w:r>
               <w:t xml:space="preserve">Derived value wins if non-empty; otherwise base value is used.</w:t>
+            </w:r>
+          </w:p>
+        </w:tc>
+      </w:tr>
+      <w:tr>
+        <w:tc>
+          <w:tcPr>
+            <w:tcW w:w="2700" w:type="dxa"/>
+          </w:tcPr>
+          <w:p>
+            <w:r>
+              <w:rPr>
+                <w:rFonts w:ascii="Courier New" w:hAnsi="Courier New"/>
+                <w:sz w:val="18"/>
+                <w:szCs w:val="18"/>
+                <w:shd w:val="clear" w:color="auto" w:fill="EBEBEB"/>
+              </w:rPr>
+              <w:t xml:space="preserve">per-modality</w:t>
+            </w:r>
+          </w:p>
+        </w:tc>
+        <w:tc>
+          <w:tcPr>
+            <w:tcW w:w="6300" w:type="dxa"/>
+          </w:tcPr>
+          <w:p>
+            <w:r>
+              <w:t xml:space="preserve">Maps are merged per modality key. Derived entry wins for any modality it defines; base contributes remaining modalities. Entries for the same modality are themselves merged using these same rules.</w:t>
             </w:r>
           </w:p>
         </w:tc>
@@ -5165,6 +5336,658 @@
       </w:r>
       <w:r>
         <w:t xml:space="preserve"> in the profile's set list, which causes the tag to be written as an empty string when the profile is applied.</w:t>
+      </w:r>
+    </w:p>
+    <w:p>
+      <w:pPr>
+        <w:pStyle w:val="Heading2"/>
+      </w:pPr>
+      <w:r>
+        <w:t>6.7  Per-Modality Overrides</w:t>
+      </w:r>
+    </w:p>
+    <w:p>
+      <w:r>
+        <w:t xml:space="preserve">A profile can define different processing rules for individual DICOM modalities using the </w:t>
+      </w:r>
+      <w:r>
+        <w:rPr>
+          <w:rFonts w:ascii="Courier New" w:hAnsi="Courier New"/>
+          <w:sz w:val="18"/>
+          <w:szCs w:val="18"/>
+          <w:shd w:val="clear" w:color="auto" w:fill="EBEBEB"/>
+        </w:rPr>
+        <w:t xml:space="preserve">per-modality</w:t>
+      </w:r>
+      <w:r>
+        <w:t xml:space="preserve"> field. When a file is processed, its Modality tag (0008,0060) is checked against the map; if a matching entry exists, its settings are layered on top of the base profile settings for that file only.</w:t>
+      </w:r>
+    </w:p>
+    <w:p>
+      <w:r>
+        <w:t xml:space="preserve">Per-modality overrides are additive: they do not replace the base profile, they extend it. The supported fields within a per-modality entry are: </w:t>
+      </w:r>
+      <w:r>
+        <w:rPr>
+          <w:rFonts w:ascii="Courier New" w:hAnsi="Courier New"/>
+          <w:sz w:val="18"/>
+          <w:szCs w:val="18"/>
+          <w:shd w:val="clear" w:color="auto" w:fill="EBEBEB"/>
+        </w:rPr>
+        <w:t xml:space="preserve">set</w:t>
+      </w:r>
+      <w:r>
+        <w:t xml:space="preserve">, </w:t>
+      </w:r>
+      <w:r>
+        <w:rPr>
+          <w:rFonts w:ascii="Courier New" w:hAnsi="Courier New"/>
+          <w:sz w:val="18"/>
+          <w:szCs w:val="18"/>
+          <w:shd w:val="clear" w:color="auto" w:fill="EBEBEB"/>
+        </w:rPr>
+        <w:t xml:space="preserve">remove</w:t>
+      </w:r>
+      <w:r>
+        <w:t xml:space="preserve">, </w:t>
+      </w:r>
+      <w:r>
+        <w:rPr>
+          <w:rFonts w:ascii="Courier New" w:hAnsi="Courier New"/>
+          <w:sz w:val="18"/>
+          <w:szCs w:val="18"/>
+          <w:shd w:val="clear" w:color="auto" w:fill="EBEBEB"/>
+        </w:rPr>
+        <w:t xml:space="preserve">keep</w:t>
+      </w:r>
+      <w:r>
+        <w:t xml:space="preserve">, </w:t>
+      </w:r>
+      <w:r>
+        <w:rPr>
+          <w:rFonts w:ascii="Courier New" w:hAnsi="Courier New"/>
+          <w:sz w:val="18"/>
+          <w:szCs w:val="18"/>
+          <w:shd w:val="clear" w:color="auto" w:fill="EBEBEB"/>
+        </w:rPr>
+        <w:t xml:space="preserve">keepprivate</w:t>
+      </w:r>
+      <w:r>
+        <w:t xml:space="preserve">, </w:t>
+      </w:r>
+      <w:r>
+        <w:rPr>
+          <w:rFonts w:ascii="Courier New" w:hAnsi="Courier New"/>
+          <w:sz w:val="18"/>
+          <w:szCs w:val="18"/>
+          <w:shd w:val="clear" w:color="auto" w:fill="EBEBEB"/>
+        </w:rPr>
+        <w:t xml:space="preserve">dob</w:t>
+      </w:r>
+      <w:r>
+        <w:t xml:space="preserve">, </w:t>
+      </w:r>
+      <w:r>
+        <w:rPr>
+          <w:rFonts w:ascii="Courier New" w:hAnsi="Courier New"/>
+          <w:sz w:val="18"/>
+          <w:szCs w:val="18"/>
+          <w:shd w:val="clear" w:color="auto" w:fill="EBEBEB"/>
+        </w:rPr>
+        <w:t xml:space="preserve">uid</w:t>
+      </w:r>
+      <w:r>
+        <w:t xml:space="preserve">, </w:t>
+      </w:r>
+      <w:r>
+        <w:rPr>
+          <w:rFonts w:ascii="Courier New" w:hAnsi="Courier New"/>
+          <w:sz w:val="18"/>
+          <w:szCs w:val="18"/>
+          <w:shd w:val="clear" w:color="auto" w:fill="EBEBEB"/>
+        </w:rPr>
+        <w:t xml:space="preserve">fixvr</w:t>
+      </w:r>
+      <w:r>
+        <w:t xml:space="preserve">, </w:t>
+      </w:r>
+      <w:r>
+        <w:rPr>
+          <w:rFonts w:ascii="Courier New" w:hAnsi="Courier New"/>
+          <w:sz w:val="18"/>
+          <w:szCs w:val="18"/>
+          <w:shd w:val="clear" w:color="auto" w:fill="EBEBEB"/>
+        </w:rPr>
+        <w:t xml:space="preserve">maskrows</w:t>
+      </w:r>
+      <w:r>
+        <w:t xml:space="preserve">, and </w:t>
+      </w:r>
+      <w:r>
+        <w:rPr>
+          <w:rFonts w:ascii="Courier New" w:hAnsi="Courier New"/>
+          <w:sz w:val="18"/>
+          <w:szCs w:val="18"/>
+          <w:shd w:val="clear" w:color="auto" w:fill="EBEBEB"/>
+        </w:rPr>
+        <w:t xml:space="preserve">noprivate</w:t>
+      </w:r>
+      <w:r>
+        <w:t xml:space="preserve">. The </w:t>
+      </w:r>
+      <w:r>
+        <w:rPr>
+          <w:rFonts w:ascii="Courier New" w:hAnsi="Courier New"/>
+          <w:sz w:val="18"/>
+          <w:szCs w:val="18"/>
+          <w:shd w:val="clear" w:color="auto" w:fill="EBEBEB"/>
+        </w:rPr>
+        <w:t xml:space="preserve">per-modality</w:t>
+      </w:r>
+      <w:r>
+        <w:t xml:space="preserve"> and </w:t>
+      </w:r>
+      <w:r>
+        <w:rPr>
+          <w:rFonts w:ascii="Courier New" w:hAnsi="Courier New"/>
+          <w:sz w:val="18"/>
+          <w:szCs w:val="18"/>
+          <w:shd w:val="clear" w:color="auto" w:fill="EBEBEB"/>
+        </w:rPr>
+        <w:t xml:space="preserve">base</w:t>
+      </w:r>
+      <w:r>
+        <w:t xml:space="preserve"> fields are not supported inside a per-modality entry.</w:t>
+      </w:r>
+    </w:p>
+    <w:p>
+      <w:r>
+        <w:t xml:space="preserve">Modality keys are matched case-insensitively. Tag aliases are resolved the same way as in top-level profile fields.</w:t>
+      </w:r>
+    </w:p>
+    <w:p>
+      <w:r>
+        <w:t xml:space="preserve">Merge rules for per-modality overrides (applied at runtime, per file):</w:t>
+      </w:r>
+    </w:p>
+    <w:tbl>
+      <w:tblPr>
+        <w:tblW w:w="0" w:type="auto"/>
+        <w:tblBorders>
+          <w:top w:val="single" w:sz="4" w:space="0" w:color="BBBBBB"/>
+          <w:left w:val="single" w:sz="4" w:space="0" w:color="BBBBBB"/>
+          <w:bottom w:val="single" w:sz="4" w:space="0" w:color="BBBBBB"/>
+          <w:right w:val="single" w:sz="4" w:space="0" w:color="BBBBBB"/>
+          <w:insideH w:val="single" w:sz="4" w:space="0" w:color="BBBBBB"/>
+          <w:insideV w:val="single" w:sz="4" w:space="0" w:color="BBBBBB"/>
+        </w:tblBorders>
+        <w:tblCellMar>
+          <w:top w:w="80" w:type="dxa"/>
+          <w:left w:w="140" w:type="dxa"/>
+          <w:bottom w:w="80" w:type="dxa"/>
+          <w:right w:w="140" w:type="dxa"/>
+        </w:tblCellMar>
+      </w:tblPr>
+      <w:tblGrid>
+        <w:gridCol w:w="2700"/>
+        <w:gridCol w:w="6300"/>
+      </w:tblGrid>
+      <w:tr>
+        <w:tc>
+          <w:tcPr>
+            <w:tcW w:w="2700" w:type="dxa"/>
+            <w:shd w:val="clear" w:color="auto" w:fill="2E74B5"/>
+          </w:tcPr>
+          <w:p>
+            <w:r>
+              <w:rPr>
+                <w:b/>
+                <w:color w:val="FFFFFF"/>
+                <w:sz w:val="20"/>
+                <w:szCs w:val="20"/>
+              </w:rPr>
+              <w:t xml:space="preserve">Field</w:t>
+            </w:r>
+          </w:p>
+        </w:tc>
+        <w:tc>
+          <w:tcPr>
+            <w:tcW w:w="6300" w:type="dxa"/>
+            <w:shd w:val="clear" w:color="auto" w:fill="2E74B5"/>
+          </w:tcPr>
+          <w:p>
+            <w:r>
+              <w:rPr>
+                <w:b/>
+                <w:color w:val="FFFFFF"/>
+                <w:sz w:val="20"/>
+                <w:szCs w:val="20"/>
+              </w:rPr>
+              <w:t xml:space="preserve">Behaviour when modality matches</w:t>
+            </w:r>
+          </w:p>
+        </w:tc>
+      </w:tr>
+      <w:tr>
+        <w:tc>
+          <w:tcPr>
+            <w:tcW w:w="2700" w:type="dxa"/>
+          </w:tcPr>
+          <w:p>
+            <w:r>
+              <w:rPr>
+                <w:rFonts w:ascii="Courier New" w:hAnsi="Courier New"/>
+                <w:sz w:val="18"/>
+                <w:szCs w:val="18"/>
+                <w:shd w:val="clear" w:color="auto" w:fill="EBEBEB"/>
+              </w:rPr>
+              <w:t xml:space="preserve">set</w:t>
+            </w:r>
+          </w:p>
+        </w:tc>
+        <w:tc>
+          <w:tcPr>
+            <w:tcW w:w="6300" w:type="dxa"/>
+          </w:tcPr>
+          <w:p>
+            <w:r>
+              <w:t xml:space="preserve">Override entries win per tag; base profile tags not overridden are kept.</w:t>
+            </w:r>
+          </w:p>
+        </w:tc>
+      </w:tr>
+      <w:tr>
+        <w:tc>
+          <w:tcPr>
+            <w:tcW w:w="2700" w:type="dxa"/>
+            <w:shd w:val="clear" w:color="auto" w:fill="F5F5F5"/>
+          </w:tcPr>
+          <w:p>
+            <w:r>
+              <w:rPr>
+                <w:rFonts w:ascii="Courier New" w:hAnsi="Courier New"/>
+                <w:sz w:val="18"/>
+                <w:szCs w:val="18"/>
+                <w:shd w:val="clear" w:color="auto" w:fill="EBEBEB"/>
+              </w:rPr>
+              <w:t xml:space="preserve">remove</w:t>
+            </w:r>
+          </w:p>
+        </w:tc>
+        <w:tc>
+          <w:tcPr>
+            <w:tcW w:w="6300" w:type="dxa"/>
+            <w:shd w:val="clear" w:color="auto" w:fill="F5F5F5"/>
+          </w:tcPr>
+          <w:p>
+            <w:r>
+              <w:t xml:space="preserve">Union with base removals. Override adds to the list.</w:t>
+            </w:r>
+          </w:p>
+        </w:tc>
+      </w:tr>
+      <w:tr>
+        <w:tc>
+          <w:tcPr>
+            <w:tcW w:w="2700" w:type="dxa"/>
+          </w:tcPr>
+          <w:p>
+            <w:r>
+              <w:rPr>
+                <w:rFonts w:ascii="Courier New" w:hAnsi="Courier New"/>
+                <w:sz w:val="18"/>
+                <w:szCs w:val="18"/>
+                <w:shd w:val="clear" w:color="auto" w:fill="EBEBEB"/>
+              </w:rPr>
+              <w:t xml:space="preserve">keep</w:t>
+            </w:r>
+          </w:p>
+        </w:tc>
+        <w:tc>
+          <w:tcPr>
+            <w:tcW w:w="6300" w:type="dxa"/>
+          </w:tcPr>
+          <w:p>
+            <w:r>
+              <w:t xml:space="preserve">Tags listed are subtracted from the combined removal list. Use to restore a tag that the base profile removes for all other modalities.</w:t>
+            </w:r>
+          </w:p>
+        </w:tc>
+      </w:tr>
+      <w:tr>
+        <w:tc>
+          <w:tcPr>
+            <w:tcW w:w="2700" w:type="dxa"/>
+            <w:shd w:val="clear" w:color="auto" w:fill="F5F5F5"/>
+          </w:tcPr>
+          <w:p>
+            <w:r>
+              <w:rPr>
+                <w:rFonts w:ascii="Courier New" w:hAnsi="Courier New"/>
+                <w:sz w:val="18"/>
+                <w:szCs w:val="18"/>
+                <w:shd w:val="clear" w:color="auto" w:fill="EBEBEB"/>
+              </w:rPr>
+              <w:t xml:space="preserve">keepprivate: true</w:t>
+            </w:r>
+          </w:p>
+        </w:tc>
+        <w:tc>
+          <w:tcPr>
+            <w:tcW w:w="6300" w:type="dxa"/>
+            <w:shd w:val="clear" w:color="auto" w:fill="F5F5F5"/>
+          </w:tcPr>
+          <w:p>
+            <w:r>
+              <w:t xml:space="preserve">Suppresses </w:t>
+            </w:r>
+            <w:r>
+              <w:rPr>
+                <w:rFonts w:ascii="Courier New" w:hAnsi="Courier New"/>
+                <w:sz w:val="18"/>
+                <w:szCs w:val="18"/>
+                <w:shd w:val="clear" w:color="auto" w:fill="EBEBEB"/>
+              </w:rPr>
+              <w:t xml:space="preserve">noprivate</w:t>
+            </w:r>
+            <w:r>
+              <w:t xml:space="preserve"> for matched files, even when the base profile enables it. Lets private tags be preserved for a specific modality.</w:t>
+            </w:r>
+          </w:p>
+        </w:tc>
+      </w:tr>
+      <w:tr>
+        <w:tc>
+          <w:tcPr>
+            <w:tcW w:w="2700" w:type="dxa"/>
+          </w:tcPr>
+          <w:p>
+            <w:r>
+              <w:rPr>
+                <w:rFonts w:ascii="Courier New" w:hAnsi="Courier New"/>
+                <w:sz w:val="18"/>
+                <w:szCs w:val="18"/>
+                <w:shd w:val="clear" w:color="auto" w:fill="EBEBEB"/>
+              </w:rPr>
+              <w:t xml:space="preserve">noprivate: true</w:t>
+            </w:r>
+          </w:p>
+        </w:tc>
+        <w:tc>
+          <w:tcPr>
+            <w:tcW w:w="6300" w:type="dxa"/>
+          </w:tcPr>
+          <w:p>
+            <w:r>
+              <w:t xml:space="preserve">Forces private tag removal for matched files, even if the base profile does not enable it.</w:t>
+            </w:r>
+          </w:p>
+        </w:tc>
+      </w:tr>
+      <w:tr>
+        <w:tc>
+          <w:tcPr>
+            <w:tcW w:w="2700" w:type="dxa"/>
+            <w:shd w:val="clear" w:color="auto" w:fill="F5F5F5"/>
+          </w:tcPr>
+          <w:p>
+            <w:r>
+              <w:rPr>
+                <w:rFonts w:ascii="Courier New" w:hAnsi="Courier New"/>
+                <w:sz w:val="18"/>
+                <w:szCs w:val="18"/>
+                <w:shd w:val="clear" w:color="auto" w:fill="EBEBEB"/>
+              </w:rPr>
+              <w:t xml:space="preserve">dob</w:t>
+            </w:r>
+            <w:r>
+              <w:t xml:space="preserve">, </w:t>
+            </w:r>
+            <w:r>
+              <w:rPr>
+                <w:rFonts w:ascii="Courier New" w:hAnsi="Courier New"/>
+                <w:sz w:val="18"/>
+                <w:szCs w:val="18"/>
+                <w:shd w:val="clear" w:color="auto" w:fill="EBEBEB"/>
+              </w:rPr>
+              <w:t xml:space="preserve">uid</w:t>
+            </w:r>
+            <w:r>
+              <w:t xml:space="preserve">, </w:t>
+            </w:r>
+            <w:r>
+              <w:rPr>
+                <w:rFonts w:ascii="Courier New" w:hAnsi="Courier New"/>
+                <w:sz w:val="18"/>
+                <w:szCs w:val="18"/>
+                <w:shd w:val="clear" w:color="auto" w:fill="EBEBEB"/>
+              </w:rPr>
+              <w:t xml:space="preserve">fixvr</w:t>
+            </w:r>
+          </w:p>
+        </w:tc>
+        <w:tc>
+          <w:tcPr>
+            <w:tcW w:w="6300" w:type="dxa"/>
+            <w:shd w:val="clear" w:color="auto" w:fill="F5F5F5"/>
+          </w:tcPr>
+          <w:p>
+            <w:r>
+              <w:t xml:space="preserve">Replaces the base value when non-empty.</w:t>
+            </w:r>
+          </w:p>
+        </w:tc>
+      </w:tr>
+      <w:tr>
+        <w:tc>
+          <w:tcPr>
+            <w:tcW w:w="2700" w:type="dxa"/>
+          </w:tcPr>
+          <w:p>
+            <w:r>
+              <w:rPr>
+                <w:rFonts w:ascii="Courier New" w:hAnsi="Courier New"/>
+                <w:sz w:val="18"/>
+                <w:szCs w:val="18"/>
+                <w:shd w:val="clear" w:color="auto" w:fill="EBEBEB"/>
+              </w:rPr>
+              <w:t xml:space="preserve">maskrows</w:t>
+            </w:r>
+          </w:p>
+        </w:tc>
+        <w:tc>
+          <w:tcPr>
+            <w:tcW w:w="6300" w:type="dxa"/>
+          </w:tcPr>
+          <w:p>
+            <w:r>
+              <w:t xml:space="preserve">Replaces the base value when greater than zero.</w:t>
+            </w:r>
+          </w:p>
+        </w:tc>
+      </w:tr>
+    </w:tbl>
+    <w:p/>
+    <w:p>
+      <w:r>
+        <w:t xml:space="preserve">Example — remove Image Type for all modalities except MR; strip private tags everywhere except PT:</w:t>
+      </w:r>
+    </w:p>
+    <w:p>
+      <w:pPr>
+        <w:pStyle w:val="Code"/>
+      </w:pPr>
+      <w:r>
+        <w:t xml:space="preserve">{</w:t>
+      </w:r>
+    </w:p>
+    <w:p>
+      <w:pPr>
+        <w:pStyle w:val="Code"/>
+      </w:pPr>
+      <w:r>
+        <w:t xml:space="preserve">  "study-deident": {</w:t>
+      </w:r>
+    </w:p>
+    <w:p>
+      <w:pPr>
+        <w:pStyle w:val="Code"/>
+      </w:pPr>
+      <w:r>
+        <w:t xml:space="preserve">    "set":       ["PatientName=ANON", "PatientID=ANON"],</w:t>
+      </w:r>
+    </w:p>
+    <w:p>
+      <w:pPr>
+        <w:pStyle w:val="Code"/>
+      </w:pPr>
+      <w:r>
+        <w:t xml:space="preserve">    "remove":    ["8,8"],</w:t>
+      </w:r>
+    </w:p>
+    <w:p>
+      <w:pPr>
+        <w:pStyle w:val="Code"/>
+      </w:pPr>
+      <w:r>
+        <w:t xml:space="preserve">    "noprivate": true,</w:t>
+      </w:r>
+    </w:p>
+    <w:p>
+      <w:pPr>
+        <w:pStyle w:val="Code"/>
+      </w:pPr>
+      <w:r>
+        <w:t xml:space="preserve">    "fixvr":     "correct",</w:t>
+      </w:r>
+    </w:p>
+    <w:p>
+      <w:pPr>
+        <w:pStyle w:val="Code"/>
+      </w:pPr>
+      <w:r>
+        <w:t xml:space="preserve">    "per-modality": {</w:t>
+      </w:r>
+    </w:p>
+    <w:p>
+      <w:pPr>
+        <w:pStyle w:val="Code"/>
+      </w:pPr>
+      <w:r>
+        <w:t xml:space="preserve">      "MR": {</w:t>
+      </w:r>
+    </w:p>
+    <w:p>
+      <w:pPr>
+        <w:pStyle w:val="Code"/>
+      </w:pPr>
+      <w:r>
+        <w:t xml:space="preserve">        "keep": ["8,8"]</w:t>
+      </w:r>
+    </w:p>
+    <w:p>
+      <w:pPr>
+        <w:pStyle w:val="Code"/>
+      </w:pPr>
+      <w:r>
+        <w:t xml:space="preserve">      },</w:t>
+      </w:r>
+    </w:p>
+    <w:p>
+      <w:pPr>
+        <w:pStyle w:val="Code"/>
+      </w:pPr>
+      <w:r>
+        <w:t xml:space="preserve">      "PT": {</w:t>
+      </w:r>
+    </w:p>
+    <w:p>
+      <w:pPr>
+        <w:pStyle w:val="Code"/>
+      </w:pPr>
+      <w:r>
+        <w:t xml:space="preserve">        "keepprivate": true</w:t>
+      </w:r>
+    </w:p>
+    <w:p>
+      <w:pPr>
+        <w:pStyle w:val="Code"/>
+      </w:pPr>
+      <w:r>
+        <w:t xml:space="preserve">      },</w:t>
+      </w:r>
+    </w:p>
+    <w:p>
+      <w:pPr>
+        <w:pStyle w:val="Code"/>
+      </w:pPr>
+      <w:r>
+        <w:t xml:space="preserve">      "CT": {</w:t>
+      </w:r>
+    </w:p>
+    <w:p>
+      <w:pPr>
+        <w:pStyle w:val="Code"/>
+      </w:pPr>
+      <w:r>
+        <w:t xml:space="preserve">        "remove": ["18,1400", "18,1401"],</w:t>
+      </w:r>
+    </w:p>
+    <w:p>
+      <w:pPr>
+        <w:pStyle w:val="Code"/>
+      </w:pPr>
+      <w:r>
+        <w:t xml:space="preserve">        "set":    ["Manufacturer="]</w:t>
+      </w:r>
+    </w:p>
+    <w:p>
+      <w:pPr>
+        <w:pStyle w:val="Code"/>
+      </w:pPr>
+      <w:r>
+        <w:t xml:space="preserve">      }</w:t>
+      </w:r>
+    </w:p>
+    <w:p>
+      <w:pPr>
+        <w:pStyle w:val="Code"/>
+      </w:pPr>
+      <w:r>
+        <w:t xml:space="preserve">    }</w:t>
+      </w:r>
+    </w:p>
+    <w:p>
+      <w:pPr>
+        <w:pStyle w:val="Code"/>
+      </w:pPr>
+      <w:r>
+        <w:t xml:space="preserve">  }</w:t>
+      </w:r>
+    </w:p>
+    <w:p>
+      <w:pPr>
+        <w:pStyle w:val="Code"/>
+      </w:pPr>
+      <w:r>
+        <w:t xml:space="preserve">}</w:t>
+      </w:r>
+    </w:p>
+    <w:p>
+      <w:r>
+        <w:t xml:space="preserve">When </w:t>
+      </w:r>
+      <w:r>
+        <w:rPr>
+          <w:rFonts w:ascii="Courier New" w:hAnsi="Courier New"/>
+          <w:sz w:val="18"/>
+          <w:szCs w:val="18"/>
+          <w:shd w:val="clear" w:color="auto" w:fill="EBEBEB"/>
+        </w:rPr>
+        <w:t xml:space="preserve">verbose:true</w:t>
+      </w:r>
+      <w:r>
+        <w:t xml:space="preserve"> is active, a line is printed for each file that triggers a per-modality override, identifying the modality key that was matched. This provides an audit trail for de-identification workflows.</w:t>
       </w:r>
     </w:p>
     <w:p>

</xml_diff>

<commit_message>
Update default profile: rename base-anon to base-deident, remove anon-img
Co-Authored-By: Claude Sonnet 4.6 <noreply@anthropic.com>
</commit_message>
<xml_diff>
--- a/dicomtool-manual.docx
+++ b/dicomtool-manual.docx
@@ -10290,43 +10290,19 @@
     </w:p>
     <w:p>
       <w:r>
-        <w:t xml:space="preserve">Defines two built-in profiles. </w:t>
-      </w:r>
-      <w:r>
-        <w:rPr>
-          <w:rFonts w:ascii="Courier New" w:hAnsi="Courier New"/>
-          <w:sz w:val="18"/>
-          <w:szCs w:val="18"/>
-          <w:shd w:val="clear" w:color="auto" w:fill="EBEBEB"/>
-        </w:rPr>
-        <w:t xml:space="preserve">base-anon</w:t>
-      </w:r>
-      <w:r>
-        <w:t xml:space="preserve"> is a comprehensive de-identification baseline: it sets patient identity fields to anonymous values, masks the date of birth to year only, removes private tags, and removes tags commonly associated with identifying information. </w:t>
-      </w:r>
-      <w:r>
-        <w:rPr>
-          <w:rFonts w:ascii="Courier New" w:hAnsi="Courier New"/>
-          <w:sz w:val="18"/>
-          <w:szCs w:val="18"/>
-          <w:shd w:val="clear" w:color="auto" w:fill="EBEBEB"/>
-        </w:rPr>
-        <w:t xml:space="preserve">anon-img</w:t>
-      </w:r>
-      <w:r>
-        <w:t xml:space="preserve"> derives from </w:t>
-      </w:r>
-      <w:r>
-        <w:rPr>
-          <w:rFonts w:ascii="Courier New" w:hAnsi="Courier New"/>
-          <w:sz w:val="18"/>
-          <w:szCs w:val="18"/>
-          <w:shd w:val="clear" w:color="auto" w:fill="EBEBEB"/>
-        </w:rPr>
-        <w:t xml:space="preserve">base-anon</w:t>
-      </w:r>
-      <w:r>
-        <w:t xml:space="preserve"> and additionally skips Secondary Capture, Overlay, Presentation State, and Structured Report objects.</w:t>
+        <w:t xml:space="preserve">Defines one built-in profile. </w:t>
+      </w:r>
+      <w:r>
+        <w:rPr>
+          <w:rFonts w:ascii="Courier New" w:hAnsi="Courier New"/>
+          <w:sz w:val="18"/>
+          <w:szCs w:val="18"/>
+          <w:shd w:val="clear" w:color="auto" w:fill="EBEBEB"/>
+        </w:rPr>
+        <w:t xml:space="preserve">base-deident</w:t>
+      </w:r>
+      <w:r>
+        <w:t xml:space="preserve"> is a comprehensive de-identification baseline: it sets patient identity fields to anonymous values, masks the date of birth to year only, removes all private tags, corrects non-standard Value Representations, and removes over 130 tags commonly associated with identifying information.</w:t>
       </w:r>
     </w:p>
     <w:p>
@@ -10342,7 +10318,7 @@
         <w:pStyle w:val="Code"/>
       </w:pPr>
       <w:r>
-        <w:t xml:space="preserve">  "base-anon": {</w:t>
+        <w:t xml:space="preserve">  "base-deident": {</w:t>
       </w:r>
     </w:p>
     <w:p>
@@ -10703,46 +10679,6 @@
       </w:pPr>
       <w:r>
         <w:t xml:space="preserve">    "fixvr":     "correct"</w:t>
-      </w:r>
-    </w:p>
-    <w:p>
-      <w:pPr>
-        <w:pStyle w:val="Code"/>
-      </w:pPr>
-      <w:r>
-        <w:t xml:space="preserve">  },</w:t>
-      </w:r>
-    </w:p>
-    <w:p>
-      <w:pPr>
-        <w:pStyle w:val="Code"/>
-      </w:pPr>
-      <w:r>
-        <w:t xml:space="preserve">  "anon-img": {</w:t>
-      </w:r>
-    </w:p>
-    <w:p>
-      <w:pPr>
-        <w:pStyle w:val="Code"/>
-      </w:pPr>
-      <w:r>
-        <w:t xml:space="preserve">    "base":           "base-anon",</w:t>
-      </w:r>
-    </w:p>
-    <w:p>
-      <w:pPr>
-        <w:pStyle w:val="Code"/>
-      </w:pPr>
-      <w:r>
-        <w:t xml:space="preserve">    "ignoretype":     ["SECONDARY"],</w:t>
-      </w:r>
-    </w:p>
-    <w:p>
-      <w:pPr>
-        <w:pStyle w:val="Code"/>
-      </w:pPr>
-      <w:r>
-        <w:t xml:space="preserve">    "ignoremodality": ["SC", "OT", "PR", "SR"]</w:t>
       </w:r>
     </w:p>
     <w:p>

</xml_diff>

<commit_message>
Release v1.3.0: stronger de-identification
- Add remapuids:true — consistent, irreversible study-wide UID remapping
  that preserves all relationships and references while severing source linkage
- remove/noprivate/set now recurse into nested sequences (fixes nested-PHI leak)
- Map-based tag removal: O(elements) instead of O(elements x removals)
- Add cmd/modify_test.go covering recursion, UID remap, and concurrency (-race)
- Update CHANGELOG, user manual (.md/.docx), version to 1.3.0

Co-Authored-By: Claude Sonnet 4.6 <noreply@anthropic.com>
</commit_message>
<xml_diff>
--- a/dicomtool-manual.docx
+++ b/dicomtool-manual.docx
@@ -30,7 +30,7 @@
         <w:pStyle w:val="DocSubtitle"/>
       </w:pPr>
       <w:r>
-        <w:t>Usage Manual  v1.2.0</w:t>
+        <w:t>Usage Manual  v1.3.0</w:t>
       </w:r>
     </w:p>
     <w:p>
@@ -1148,6 +1148,14 @@
         <w:pStyle w:val="Code"/>
       </w:pPr>
       <w:r>
+        <w:t xml:space="preserve">    [remapuids:true]</w:t>
+      </w:r>
+    </w:p>
+    <w:p>
+      <w:pPr>
+        <w:pStyle w:val="Code"/>
+      </w:pPr>
+      <w:r>
         <w:t xml:space="preserve">    [noprivate:true]</w:t>
       </w:r>
     </w:p>
@@ -1530,15 +1538,68 @@
               <w:t xml:space="preserve">&lt;suffix&gt;</w:t>
             </w:r>
             <w:r>
-              <w:t xml:space="preserve"> must contain digits only. Transfer Syntax UIDs are excluded.</w:t>
-            </w:r>
-          </w:p>
-        </w:tc>
-      </w:tr>
-      <w:tr>
-        <w:tc>
-          <w:tcPr>
-            <w:tcW w:w="2700" w:type="dxa"/>
+              <w:t xml:space="preserve"> must contain digits only. Transfer Syntax UIDs are excluded. Mutually exclusive with </w:t>
+            </w:r>
+            <w:r>
+              <w:rPr>
+                <w:rFonts w:ascii="Courier New" w:hAnsi="Courier New"/>
+                <w:sz w:val="18"/>
+                <w:szCs w:val="18"/>
+                <w:shd w:val="clear" w:color="auto" w:fill="EBEBEB"/>
+              </w:rPr>
+              <w:t xml:space="preserve">remapuids:true</w:t>
+            </w:r>
+            <w:r>
+              <w:t xml:space="preserve">.</w:t>
+            </w:r>
+          </w:p>
+        </w:tc>
+      </w:tr>
+      <w:tr>
+        <w:tc>
+          <w:tcPr>
+            <w:tcW w:w="2700" w:type="dxa"/>
+          </w:tcPr>
+          <w:p>
+            <w:r>
+              <w:rPr>
+                <w:rFonts w:ascii="Courier New" w:hAnsi="Courier New"/>
+                <w:sz w:val="18"/>
+                <w:szCs w:val="18"/>
+                <w:shd w:val="clear" w:color="auto" w:fill="EBEBEB"/>
+              </w:rPr>
+              <w:t xml:space="preserve">remapuids:true</w:t>
+            </w:r>
+          </w:p>
+        </w:tc>
+        <w:tc>
+          <w:tcPr>
+            <w:tcW w:w="6300" w:type="dxa"/>
+          </w:tcPr>
+          <w:p>
+            <w:r>
+              <w:t xml:space="preserve">Replace every study, series, and instance UID — and all references to them — with a freshly generated UID. Remapping is consistent across the entire run: the same source UID always maps to the same new UID in every file, so study/series/instance relationships and internal cross-references are preserved while linkage to the source is severed. SOP Class UIDs, Transfer Syntax UIDs, and the Implementation Class UID are left unchanged so files remain valid. Cannot be combined with </w:t>
+            </w:r>
+            <w:r>
+              <w:rPr>
+                <w:rFonts w:ascii="Courier New" w:hAnsi="Courier New"/>
+                <w:sz w:val="18"/>
+                <w:szCs w:val="18"/>
+                <w:shd w:val="clear" w:color="auto" w:fill="EBEBEB"/>
+              </w:rPr>
+              <w:t xml:space="preserve">uid:</w:t>
+            </w:r>
+            <w:r>
+              <w:t xml:space="preserve">.</w:t>
+            </w:r>
+          </w:p>
+        </w:tc>
+      </w:tr>
+      <w:tr>
+        <w:tc>
+          <w:tcPr>
+            <w:tcW w:w="2700" w:type="dxa"/>
+            <w:shd w:val="clear" w:color="auto" w:fill="F5F5F5"/>
           </w:tcPr>
           <w:p>
             <w:r>
@@ -1555,6 +1616,7 @@
         <w:tc>
           <w:tcPr>
             <w:tcW w:w="6300" w:type="dxa"/>
+            <w:shd w:val="clear" w:color="auto" w:fill="F5F5F5"/>
           </w:tcPr>
           <w:p>
             <w:r>
@@ -1567,6 +1629,46 @@
         <w:tc>
           <w:tcPr>
             <w:tcW w:w="2700" w:type="dxa"/>
+          </w:tcPr>
+          <w:p>
+            <w:r>
+              <w:rPr>
+                <w:rFonts w:ascii="Courier New" w:hAnsi="Courier New"/>
+                <w:sz w:val="18"/>
+                <w:szCs w:val="18"/>
+                <w:shd w:val="clear" w:color="auto" w:fill="EBEBEB"/>
+              </w:rPr>
+              <w:t xml:space="preserve">ignoretype:&lt;types&gt;</w:t>
+            </w:r>
+          </w:p>
+        </w:tc>
+        <w:tc>
+          <w:tcPr>
+            <w:tcW w:w="6300" w:type="dxa"/>
+          </w:tcPr>
+          <w:p>
+            <w:r>
+              <w:t xml:space="preserve">Skip files whose Image Type tag (0008,0008) contains any of the supplied comma-delimited values. Comparison is case-insensitive. Example: </w:t>
+            </w:r>
+            <w:r>
+              <w:rPr>
+                <w:rFonts w:ascii="Courier New" w:hAnsi="Courier New"/>
+                <w:sz w:val="18"/>
+                <w:szCs w:val="18"/>
+                <w:shd w:val="clear" w:color="auto" w:fill="EBEBEB"/>
+              </w:rPr>
+              <w:t xml:space="preserve">ignoretype:SECONDARY,DERIVED</w:t>
+            </w:r>
+            <w:r>
+              <w:t xml:space="preserve">.</w:t>
+            </w:r>
+          </w:p>
+        </w:tc>
+      </w:tr>
+      <w:tr>
+        <w:tc>
+          <w:tcPr>
+            <w:tcW w:w="2700" w:type="dxa"/>
             <w:shd w:val="clear" w:color="auto" w:fill="F5F5F5"/>
           </w:tcPr>
           <w:p>
@@ -1577,7 +1679,7 @@
                 <w:szCs w:val="18"/>
                 <w:shd w:val="clear" w:color="auto" w:fill="EBEBEB"/>
               </w:rPr>
-              <w:t xml:space="preserve">ignoretype:&lt;types&gt;</w:t>
+              <w:t xml:space="preserve">ignoremodality:&lt;modalities&gt;</w:t>
             </w:r>
           </w:p>
         </w:tc>
@@ -1588,16 +1690,16 @@
           </w:tcPr>
           <w:p>
             <w:r>
-              <w:t xml:space="preserve">Skip files whose Image Type tag (0008,0008) contains any of the supplied comma-delimited values. Comparison is case-insensitive. Example: </w:t>
-            </w:r>
-            <w:r>
-              <w:rPr>
-                <w:rFonts w:ascii="Courier New" w:hAnsi="Courier New"/>
-                <w:sz w:val="18"/>
-                <w:szCs w:val="18"/>
-                <w:shd w:val="clear" w:color="auto" w:fill="EBEBEB"/>
-              </w:rPr>
-              <w:t xml:space="preserve">ignoretype:SECONDARY,DERIVED</w:t>
+              <w:t xml:space="preserve">Skip files whose Modality tag (0008,0060) matches any of the supplied comma-delimited values. Comparison is case-insensitive. Example: </w:t>
+            </w:r>
+            <w:r>
+              <w:rPr>
+                <w:rFonts w:ascii="Courier New" w:hAnsi="Courier New"/>
+                <w:sz w:val="18"/>
+                <w:szCs w:val="18"/>
+                <w:shd w:val="clear" w:color="auto" w:fill="EBEBEB"/>
+              </w:rPr>
+              <w:t xml:space="preserve">ignoremodality:SC,PR</w:t>
             </w:r>
             <w:r>
               <w:t xml:space="preserve">.</w:t>
@@ -1618,26 +1720,246 @@
                 <w:szCs w:val="18"/>
                 <w:shd w:val="clear" w:color="auto" w:fill="EBEBEB"/>
               </w:rPr>
-              <w:t xml:space="preserve">ignoremodality:&lt;modalities&gt;</w:t>
-            </w:r>
-          </w:p>
-        </w:tc>
-        <w:tc>
-          <w:tcPr>
-            <w:tcW w:w="6300" w:type="dxa"/>
-          </w:tcPr>
-          <w:p>
-            <w:r>
-              <w:t xml:space="preserve">Skip files whose Modality tag (0008,0060) matches any of the supplied comma-delimited values. Comparison is case-insensitive. Example: </w:t>
-            </w:r>
-            <w:r>
-              <w:rPr>
-                <w:rFonts w:ascii="Courier New" w:hAnsi="Courier New"/>
-                <w:sz w:val="18"/>
-                <w:szCs w:val="18"/>
-                <w:shd w:val="clear" w:color="auto" w:fill="EBEBEB"/>
-              </w:rPr>
-              <w:t xml:space="preserve">ignoremodality:SC,PR</w:t>
+              <w:t xml:space="preserve">maskrows:&lt;n&gt;</w:t>
+            </w:r>
+          </w:p>
+        </w:tc>
+        <w:tc>
+          <w:tcPr>
+            <w:tcW w:w="6300" w:type="dxa"/>
+          </w:tcPr>
+          <w:p>
+            <w:r>
+              <w:t xml:space="preserve">Zero out the first </w:t>
+            </w:r>
+            <w:r>
+              <w:rPr>
+                <w:rFonts w:ascii="Courier New" w:hAnsi="Courier New"/>
+                <w:sz w:val="18"/>
+                <w:szCs w:val="18"/>
+                <w:shd w:val="clear" w:color="auto" w:fill="EBEBEB"/>
+              </w:rPr>
+              <w:t xml:space="preserve">n</w:t>
+            </w:r>
+            <w:r>
+              <w:t xml:space="preserve"> pixel rows from the top of each image frame. Applies only to uncompressed (native) pixel data; compressed files produce a warning when </w:t>
+            </w:r>
+            <w:r>
+              <w:rPr>
+                <w:rFonts w:ascii="Courier New" w:hAnsi="Courier New"/>
+                <w:sz w:val="18"/>
+                <w:szCs w:val="18"/>
+                <w:shd w:val="clear" w:color="auto" w:fill="EBEBEB"/>
+              </w:rPr>
+              <w:t xml:space="preserve">verbose:true</w:t>
+            </w:r>
+            <w:r>
+              <w:t xml:space="preserve"> is set. </w:t>
+            </w:r>
+            <w:r>
+              <w:rPr>
+                <w:rFonts w:ascii="Courier New" w:hAnsi="Courier New"/>
+                <w:sz w:val="18"/>
+                <w:szCs w:val="18"/>
+                <w:shd w:val="clear" w:color="auto" w:fill="EBEBEB"/>
+              </w:rPr>
+              <w:t xml:space="preserve">n</w:t>
+            </w:r>
+            <w:r>
+              <w:t xml:space="preserve"> must be a positive integer.</w:t>
+            </w:r>
+          </w:p>
+        </w:tc>
+      </w:tr>
+      <w:tr>
+        <w:tc>
+          <w:tcPr>
+            <w:tcW w:w="2700" w:type="dxa"/>
+            <w:shd w:val="clear" w:color="auto" w:fill="F5F5F5"/>
+          </w:tcPr>
+          <w:p>
+            <w:r>
+              <w:rPr>
+                <w:rFonts w:ascii="Courier New" w:hAnsi="Courier New"/>
+                <w:sz w:val="18"/>
+                <w:szCs w:val="18"/>
+                <w:shd w:val="clear" w:color="auto" w:fill="EBEBEB"/>
+              </w:rPr>
+              <w:t xml:space="preserve">fixvr:correct|skip|passthrough</w:t>
+            </w:r>
+          </w:p>
+        </w:tc>
+        <w:tc>
+          <w:tcPr>
+            <w:tcW w:w="6300" w:type="dxa"/>
+            <w:shd w:val="clear" w:color="auto" w:fill="F5F5F5"/>
+          </w:tcPr>
+          <w:p>
+            <w:r>
+              <w:t xml:space="preserve">Handle tags whose Value Representation (VR) does not match the DICOM standard dictionary. </w:t>
+            </w:r>
+            <w:r>
+              <w:rPr>
+                <w:rFonts w:ascii="Courier New" w:hAnsi="Courier New"/>
+                <w:sz w:val="18"/>
+                <w:szCs w:val="18"/>
+                <w:shd w:val="clear" w:color="auto" w:fill="EBEBEB"/>
+              </w:rPr>
+              <w:t xml:space="preserve">correct</w:t>
+            </w:r>
+            <w:r>
+              <w:t xml:space="preserve"> attempts to re-encode the tag value under the correct VR, falling back to removal if the conversion is not possible. </w:t>
+            </w:r>
+            <w:r>
+              <w:rPr>
+                <w:rFonts w:ascii="Courier New" w:hAnsi="Courier New"/>
+                <w:sz w:val="18"/>
+                <w:szCs w:val="18"/>
+                <w:shd w:val="clear" w:color="auto" w:fill="EBEBEB"/>
+              </w:rPr>
+              <w:t xml:space="preserve">skip</w:t>
+            </w:r>
+            <w:r>
+              <w:t xml:space="preserve"> silently removes all mismatched tags. </w:t>
+            </w:r>
+            <w:r>
+              <w:rPr>
+                <w:rFonts w:ascii="Courier New" w:hAnsi="Courier New"/>
+                <w:sz w:val="18"/>
+                <w:szCs w:val="18"/>
+                <w:shd w:val="clear" w:color="auto" w:fill="EBEBEB"/>
+              </w:rPr>
+              <w:t xml:space="preserve">passthrough</w:t>
+            </w:r>
+            <w:r>
+              <w:t xml:space="preserve"> writes the file as-is, suppressing the VR verification error. Private and unknown tags are always kept unchanged. When </w:t>
+            </w:r>
+            <w:r>
+              <w:rPr>
+                <w:rFonts w:ascii="Courier New" w:hAnsi="Courier New"/>
+                <w:sz w:val="18"/>
+                <w:szCs w:val="18"/>
+                <w:shd w:val="clear" w:color="auto" w:fill="EBEBEB"/>
+              </w:rPr>
+              <w:t xml:space="preserve">verbose:true</w:t>
+            </w:r>
+            <w:r>
+              <w:t xml:space="preserve"> is set, each affected tag is reported.</w:t>
+            </w:r>
+          </w:p>
+        </w:tc>
+      </w:tr>
+      <w:tr>
+        <w:tc>
+          <w:tcPr>
+            <w:tcW w:w="2700" w:type="dxa"/>
+          </w:tcPr>
+          <w:p>
+            <w:r>
+              <w:rPr>
+                <w:rFonts w:ascii="Courier New" w:hAnsi="Courier New"/>
+                <w:sz w:val="18"/>
+                <w:szCs w:val="18"/>
+                <w:shd w:val="clear" w:color="auto" w:fill="EBEBEB"/>
+              </w:rPr>
+              <w:t xml:space="preserve">workers:&lt;n&gt;</w:t>
+            </w:r>
+          </w:p>
+        </w:tc>
+        <w:tc>
+          <w:tcPr>
+            <w:tcW w:w="6300" w:type="dxa"/>
+          </w:tcPr>
+          <w:p>
+            <w:r>
+              <w:t xml:space="preserve">Number of files to process simultaneously. Defaults to the number of logical CPU cores. Set to </w:t>
+            </w:r>
+            <w:r>
+              <w:rPr>
+                <w:rFonts w:ascii="Courier New" w:hAnsi="Courier New"/>
+                <w:sz w:val="18"/>
+                <w:szCs w:val="18"/>
+                <w:shd w:val="clear" w:color="auto" w:fill="EBEBEB"/>
+              </w:rPr>
+              <w:t xml:space="preserve">1</w:t>
+            </w:r>
+            <w:r>
+              <w:t xml:space="preserve"> to process files serially. Set to </w:t>
+            </w:r>
+            <w:r>
+              <w:rPr>
+                <w:rFonts w:ascii="Courier New" w:hAnsi="Courier New"/>
+                <w:sz w:val="18"/>
+                <w:szCs w:val="18"/>
+                <w:shd w:val="clear" w:color="auto" w:fill="EBEBEB"/>
+              </w:rPr>
+              <w:t xml:space="preserve">0</w:t>
+            </w:r>
+            <w:r>
+              <w:t xml:space="preserve"> to restore the default.</w:t>
+            </w:r>
+          </w:p>
+        </w:tc>
+      </w:tr>
+      <w:tr>
+        <w:tc>
+          <w:tcPr>
+            <w:tcW w:w="2700" w:type="dxa"/>
+            <w:shd w:val="clear" w:color="auto" w:fill="F5F5F5"/>
+          </w:tcPr>
+          <w:p>
+            <w:r>
+              <w:rPr>
+                <w:rFonts w:ascii="Courier New" w:hAnsi="Courier New"/>
+                <w:sz w:val="18"/>
+                <w:szCs w:val="18"/>
+                <w:shd w:val="clear" w:color="auto" w:fill="EBEBEB"/>
+              </w:rPr>
+              <w:t xml:space="preserve">zip:true</w:t>
+            </w:r>
+          </w:p>
+        </w:tc>
+        <w:tc>
+          <w:tcPr>
+            <w:tcW w:w="6300" w:type="dxa"/>
+            <w:shd w:val="clear" w:color="auto" w:fill="F5F5F5"/>
+          </w:tcPr>
+          <w:p>
+            <w:r>
+              <w:t xml:space="preserve">Package all output files into a single ZIP archive instead of writing them to a directory. The </w:t>
+            </w:r>
+            <w:r>
+              <w:rPr>
+                <w:rFonts w:ascii="Courier New" w:hAnsi="Courier New"/>
+                <w:sz w:val="18"/>
+                <w:szCs w:val="18"/>
+                <w:shd w:val="clear" w:color="auto" w:fill="EBEBEB"/>
+              </w:rPr>
+              <w:t xml:space="preserve">output:</w:t>
+            </w:r>
+            <w:r>
+              <w:t xml:space="preserve"> path is used as the ZIP file name; a </w:t>
+            </w:r>
+            <w:r>
+              <w:rPr>
+                <w:rFonts w:ascii="Courier New" w:hAnsi="Courier New"/>
+                <w:sz w:val="18"/>
+                <w:szCs w:val="18"/>
+                <w:shd w:val="clear" w:color="auto" w:fill="EBEBEB"/>
+              </w:rPr>
+              <w:t xml:space="preserve">.zip</w:t>
+            </w:r>
+            <w:r>
+              <w:t xml:space="preserve"> extension is appended automatically if not already present. Cannot be combined with </w:t>
+            </w:r>
+            <w:r>
+              <w:rPr>
+                <w:rFonts w:ascii="Courier New" w:hAnsi="Courier New"/>
+                <w:sz w:val="18"/>
+                <w:szCs w:val="18"/>
+                <w:shd w:val="clear" w:color="auto" w:fill="EBEBEB"/>
+              </w:rPr>
+              <w:t xml:space="preserve">dicomdir:true</w:t>
             </w:r>
             <w:r>
               <w:t xml:space="preserve">.</w:t>
@@ -1649,6 +1971,46 @@
         <w:tc>
           <w:tcPr>
             <w:tcW w:w="2700" w:type="dxa"/>
+          </w:tcPr>
+          <w:p>
+            <w:r>
+              <w:rPr>
+                <w:rFonts w:ascii="Courier New" w:hAnsi="Courier New"/>
+                <w:sz w:val="18"/>
+                <w:szCs w:val="18"/>
+                <w:shd w:val="clear" w:color="auto" w:fill="EBEBEB"/>
+              </w:rPr>
+              <w:t xml:space="preserve">dicomdir:true</w:t>
+            </w:r>
+          </w:p>
+        </w:tc>
+        <w:tc>
+          <w:tcPr>
+            <w:tcW w:w="6300" w:type="dxa"/>
+          </w:tcPr>
+          <w:p>
+            <w:r>
+              <w:t xml:space="preserve">After all files have been written, generate a DICOMDIR index file in the output directory. Cannot be combined with </w:t>
+            </w:r>
+            <w:r>
+              <w:rPr>
+                <w:rFonts w:ascii="Courier New" w:hAnsi="Courier New"/>
+                <w:sz w:val="18"/>
+                <w:szCs w:val="18"/>
+                <w:shd w:val="clear" w:color="auto" w:fill="EBEBEB"/>
+              </w:rPr>
+              <w:t xml:space="preserve">zip:true</w:t>
+            </w:r>
+            <w:r>
+              <w:t xml:space="preserve">.</w:t>
+            </w:r>
+          </w:p>
+        </w:tc>
+      </w:tr>
+      <w:tr>
+        <w:tc>
+          <w:tcPr>
+            <w:tcW w:w="2700" w:type="dxa"/>
             <w:shd w:val="clear" w:color="auto" w:fill="F5F5F5"/>
           </w:tcPr>
           <w:p>
@@ -1659,7 +2021,7 @@
                 <w:szCs w:val="18"/>
                 <w:shd w:val="clear" w:color="auto" w:fill="EBEBEB"/>
               </w:rPr>
-              <w:t xml:space="preserve">maskrows:&lt;n&gt;</w:t>
+              <w:t xml:space="preserve">profile:&lt;name&gt;</w:t>
             </w:r>
           </w:p>
         </w:tc>
@@ -1670,20 +2032,29 @@
           </w:tcPr>
           <w:p>
             <w:r>
-              <w:t xml:space="preserve">Zero out the first </w:t>
-            </w:r>
-            <w:r>
-              <w:rPr>
-                <w:rFonts w:ascii="Courier New" w:hAnsi="Courier New"/>
-                <w:sz w:val="18"/>
-                <w:szCs w:val="18"/>
-                <w:shd w:val="clear" w:color="auto" w:fill="EBEBEB"/>
-              </w:rPr>
-              <w:t xml:space="preserve">n</w:t>
-            </w:r>
-            <w:r>
-              <w:t xml:space="preserve"> pixel rows from the top of each image frame. Applies only to uncompressed (native) pixel data; compressed files produce a warning when </w:t>
-            </w:r>
+              <w:t xml:space="preserve">Apply a named processing profile from </w:t>
+            </w:r>
+            <w:r>
+              <w:rPr>
+                <w:rFonts w:ascii="Courier New" w:hAnsi="Courier New"/>
+                <w:sz w:val="18"/>
+                <w:szCs w:val="18"/>
+                <w:shd w:val="clear" w:color="auto" w:fill="EBEBEB"/>
+              </w:rPr>
+              <w:t xml:space="preserve">profiles.json</w:t>
+            </w:r>
+            <w:r>
+              <w:t xml:space="preserve">. CLI parameters take precedence over profile values. See Section 6.</w:t>
+            </w:r>
+          </w:p>
+        </w:tc>
+      </w:tr>
+      <w:tr>
+        <w:tc>
+          <w:tcPr>
+            <w:tcW w:w="2700" w:type="dxa"/>
+          </w:tcPr>
+          <w:p>
             <w:r>
               <w:rPr>
                 <w:rFonts w:ascii="Courier New" w:hAnsi="Courier New"/>
@@ -1693,322 +2064,11 @@
               </w:rPr>
               <w:t xml:space="preserve">verbose:true</w:t>
             </w:r>
-            <w:r>
-              <w:t xml:space="preserve"> is set. </w:t>
-            </w:r>
-            <w:r>
-              <w:rPr>
-                <w:rFonts w:ascii="Courier New" w:hAnsi="Courier New"/>
-                <w:sz w:val="18"/>
-                <w:szCs w:val="18"/>
-                <w:shd w:val="clear" w:color="auto" w:fill="EBEBEB"/>
-              </w:rPr>
-              <w:t xml:space="preserve">n</w:t>
-            </w:r>
-            <w:r>
-              <w:t xml:space="preserve"> must be a positive integer.</w:t>
-            </w:r>
-          </w:p>
-        </w:tc>
-      </w:tr>
-      <w:tr>
-        <w:tc>
-          <w:tcPr>
-            <w:tcW w:w="2700" w:type="dxa"/>
-          </w:tcPr>
-          <w:p>
-            <w:r>
-              <w:rPr>
-                <w:rFonts w:ascii="Courier New" w:hAnsi="Courier New"/>
-                <w:sz w:val="18"/>
-                <w:szCs w:val="18"/>
-                <w:shd w:val="clear" w:color="auto" w:fill="EBEBEB"/>
-              </w:rPr>
-              <w:t xml:space="preserve">fixvr:correct|skip|passthrough</w:t>
-            </w:r>
-          </w:p>
-        </w:tc>
-        <w:tc>
-          <w:tcPr>
-            <w:tcW w:w="6300" w:type="dxa"/>
-          </w:tcPr>
-          <w:p>
-            <w:r>
-              <w:t xml:space="preserve">Handle tags whose Value Representation (VR) does not match the DICOM standard dictionary. </w:t>
-            </w:r>
-            <w:r>
-              <w:rPr>
-                <w:rFonts w:ascii="Courier New" w:hAnsi="Courier New"/>
-                <w:sz w:val="18"/>
-                <w:szCs w:val="18"/>
-                <w:shd w:val="clear" w:color="auto" w:fill="EBEBEB"/>
-              </w:rPr>
-              <w:t xml:space="preserve">correct</w:t>
-            </w:r>
-            <w:r>
-              <w:t xml:space="preserve"> attempts to re-encode the tag value under the correct VR, falling back to removal if the conversion is not possible. </w:t>
-            </w:r>
-            <w:r>
-              <w:rPr>
-                <w:rFonts w:ascii="Courier New" w:hAnsi="Courier New"/>
-                <w:sz w:val="18"/>
-                <w:szCs w:val="18"/>
-                <w:shd w:val="clear" w:color="auto" w:fill="EBEBEB"/>
-              </w:rPr>
-              <w:t xml:space="preserve">skip</w:t>
-            </w:r>
-            <w:r>
-              <w:t xml:space="preserve"> silently removes all mismatched tags. </w:t>
-            </w:r>
-            <w:r>
-              <w:rPr>
-                <w:rFonts w:ascii="Courier New" w:hAnsi="Courier New"/>
-                <w:sz w:val="18"/>
-                <w:szCs w:val="18"/>
-                <w:shd w:val="clear" w:color="auto" w:fill="EBEBEB"/>
-              </w:rPr>
-              <w:t xml:space="preserve">passthrough</w:t>
-            </w:r>
-            <w:r>
-              <w:t xml:space="preserve"> writes the file as-is, suppressing the VR verification error. Private and unknown tags are always kept unchanged. When </w:t>
-            </w:r>
-            <w:r>
-              <w:rPr>
-                <w:rFonts w:ascii="Courier New" w:hAnsi="Courier New"/>
-                <w:sz w:val="18"/>
-                <w:szCs w:val="18"/>
-                <w:shd w:val="clear" w:color="auto" w:fill="EBEBEB"/>
-              </w:rPr>
-              <w:t xml:space="preserve">verbose:true</w:t>
-            </w:r>
-            <w:r>
-              <w:t xml:space="preserve"> is set, each affected tag is reported.</w:t>
-            </w:r>
-          </w:p>
-        </w:tc>
-      </w:tr>
-      <w:tr>
-        <w:tc>
-          <w:tcPr>
-            <w:tcW w:w="2700" w:type="dxa"/>
-            <w:shd w:val="clear" w:color="auto" w:fill="F5F5F5"/>
-          </w:tcPr>
-          <w:p>
-            <w:r>
-              <w:rPr>
-                <w:rFonts w:ascii="Courier New" w:hAnsi="Courier New"/>
-                <w:sz w:val="18"/>
-                <w:szCs w:val="18"/>
-                <w:shd w:val="clear" w:color="auto" w:fill="EBEBEB"/>
-              </w:rPr>
-              <w:t xml:space="preserve">workers:&lt;n&gt;</w:t>
-            </w:r>
-          </w:p>
-        </w:tc>
-        <w:tc>
-          <w:tcPr>
-            <w:tcW w:w="6300" w:type="dxa"/>
-            <w:shd w:val="clear" w:color="auto" w:fill="F5F5F5"/>
-          </w:tcPr>
-          <w:p>
-            <w:r>
-              <w:t xml:space="preserve">Number of files to process simultaneously. Defaults to the number of logical CPU cores. Set to </w:t>
-            </w:r>
-            <w:r>
-              <w:rPr>
-                <w:rFonts w:ascii="Courier New" w:hAnsi="Courier New"/>
-                <w:sz w:val="18"/>
-                <w:szCs w:val="18"/>
-                <w:shd w:val="clear" w:color="auto" w:fill="EBEBEB"/>
-              </w:rPr>
-              <w:t xml:space="preserve">1</w:t>
-            </w:r>
-            <w:r>
-              <w:t xml:space="preserve"> to process files serially. Set to </w:t>
-            </w:r>
-            <w:r>
-              <w:rPr>
-                <w:rFonts w:ascii="Courier New" w:hAnsi="Courier New"/>
-                <w:sz w:val="18"/>
-                <w:szCs w:val="18"/>
-                <w:shd w:val="clear" w:color="auto" w:fill="EBEBEB"/>
-              </w:rPr>
-              <w:t xml:space="preserve">0</w:t>
-            </w:r>
-            <w:r>
-              <w:t xml:space="preserve"> to restore the default.</w:t>
-            </w:r>
-          </w:p>
-        </w:tc>
-      </w:tr>
-      <w:tr>
-        <w:tc>
-          <w:tcPr>
-            <w:tcW w:w="2700" w:type="dxa"/>
-          </w:tcPr>
-          <w:p>
-            <w:r>
-              <w:rPr>
-                <w:rFonts w:ascii="Courier New" w:hAnsi="Courier New"/>
-                <w:sz w:val="18"/>
-                <w:szCs w:val="18"/>
-                <w:shd w:val="clear" w:color="auto" w:fill="EBEBEB"/>
-              </w:rPr>
-              <w:t xml:space="preserve">zip:true</w:t>
-            </w:r>
-          </w:p>
-        </w:tc>
-        <w:tc>
-          <w:tcPr>
-            <w:tcW w:w="6300" w:type="dxa"/>
-          </w:tcPr>
-          <w:p>
-            <w:r>
-              <w:t xml:space="preserve">Package all output files into a single ZIP archive instead of writing them to a directory. The </w:t>
-            </w:r>
-            <w:r>
-              <w:rPr>
-                <w:rFonts w:ascii="Courier New" w:hAnsi="Courier New"/>
-                <w:sz w:val="18"/>
-                <w:szCs w:val="18"/>
-                <w:shd w:val="clear" w:color="auto" w:fill="EBEBEB"/>
-              </w:rPr>
-              <w:t xml:space="preserve">output:</w:t>
-            </w:r>
-            <w:r>
-              <w:t xml:space="preserve"> path is used as the ZIP file name; a </w:t>
-            </w:r>
-            <w:r>
-              <w:rPr>
-                <w:rFonts w:ascii="Courier New" w:hAnsi="Courier New"/>
-                <w:sz w:val="18"/>
-                <w:szCs w:val="18"/>
-                <w:shd w:val="clear" w:color="auto" w:fill="EBEBEB"/>
-              </w:rPr>
-              <w:t xml:space="preserve">.zip</w:t>
-            </w:r>
-            <w:r>
-              <w:t xml:space="preserve"> extension is appended automatically if not already present. Cannot be combined with </w:t>
-            </w:r>
-            <w:r>
-              <w:rPr>
-                <w:rFonts w:ascii="Courier New" w:hAnsi="Courier New"/>
-                <w:sz w:val="18"/>
-                <w:szCs w:val="18"/>
-                <w:shd w:val="clear" w:color="auto" w:fill="EBEBEB"/>
-              </w:rPr>
-              <w:t xml:space="preserve">dicomdir:true</w:t>
-            </w:r>
-            <w:r>
-              <w:t xml:space="preserve">.</w:t>
-            </w:r>
-          </w:p>
-        </w:tc>
-      </w:tr>
-      <w:tr>
-        <w:tc>
-          <w:tcPr>
-            <w:tcW w:w="2700" w:type="dxa"/>
-            <w:shd w:val="clear" w:color="auto" w:fill="F5F5F5"/>
-          </w:tcPr>
-          <w:p>
-            <w:r>
-              <w:rPr>
-                <w:rFonts w:ascii="Courier New" w:hAnsi="Courier New"/>
-                <w:sz w:val="18"/>
-                <w:szCs w:val="18"/>
-                <w:shd w:val="clear" w:color="auto" w:fill="EBEBEB"/>
-              </w:rPr>
-              <w:t xml:space="preserve">dicomdir:true</w:t>
-            </w:r>
-          </w:p>
-        </w:tc>
-        <w:tc>
-          <w:tcPr>
-            <w:tcW w:w="6300" w:type="dxa"/>
-            <w:shd w:val="clear" w:color="auto" w:fill="F5F5F5"/>
-          </w:tcPr>
-          <w:p>
-            <w:r>
-              <w:t xml:space="preserve">After all files have been written, generate a DICOMDIR index file in the output directory. Cannot be combined with </w:t>
-            </w:r>
-            <w:r>
-              <w:rPr>
-                <w:rFonts w:ascii="Courier New" w:hAnsi="Courier New"/>
-                <w:sz w:val="18"/>
-                <w:szCs w:val="18"/>
-                <w:shd w:val="clear" w:color="auto" w:fill="EBEBEB"/>
-              </w:rPr>
-              <w:t xml:space="preserve">zip:true</w:t>
-            </w:r>
-            <w:r>
-              <w:t xml:space="preserve">.</w:t>
-            </w:r>
-          </w:p>
-        </w:tc>
-      </w:tr>
-      <w:tr>
-        <w:tc>
-          <w:tcPr>
-            <w:tcW w:w="2700" w:type="dxa"/>
-          </w:tcPr>
-          <w:p>
-            <w:r>
-              <w:rPr>
-                <w:rFonts w:ascii="Courier New" w:hAnsi="Courier New"/>
-                <w:sz w:val="18"/>
-                <w:szCs w:val="18"/>
-                <w:shd w:val="clear" w:color="auto" w:fill="EBEBEB"/>
-              </w:rPr>
-              <w:t xml:space="preserve">profile:&lt;name&gt;</w:t>
-            </w:r>
-          </w:p>
-        </w:tc>
-        <w:tc>
-          <w:tcPr>
-            <w:tcW w:w="6300" w:type="dxa"/>
-          </w:tcPr>
-          <w:p>
-            <w:r>
-              <w:t xml:space="preserve">Apply a named processing profile from </w:t>
-            </w:r>
-            <w:r>
-              <w:rPr>
-                <w:rFonts w:ascii="Courier New" w:hAnsi="Courier New"/>
-                <w:sz w:val="18"/>
-                <w:szCs w:val="18"/>
-                <w:shd w:val="clear" w:color="auto" w:fill="EBEBEB"/>
-              </w:rPr>
-              <w:t xml:space="preserve">profiles.json</w:t>
-            </w:r>
-            <w:r>
-              <w:t xml:space="preserve">. CLI parameters take precedence over profile values. See Section 6.</w:t>
-            </w:r>
-          </w:p>
-        </w:tc>
-      </w:tr>
-      <w:tr>
-        <w:tc>
-          <w:tcPr>
-            <w:tcW w:w="2700" w:type="dxa"/>
-            <w:shd w:val="clear" w:color="auto" w:fill="F5F5F5"/>
-          </w:tcPr>
-          <w:p>
-            <w:r>
-              <w:rPr>
-                <w:rFonts w:ascii="Courier New" w:hAnsi="Courier New"/>
-                <w:sz w:val="18"/>
-                <w:szCs w:val="18"/>
-                <w:shd w:val="clear" w:color="auto" w:fill="EBEBEB"/>
-              </w:rPr>
-              <w:t xml:space="preserve">verbose:true</w:t>
-            </w:r>
-          </w:p>
-        </w:tc>
-        <w:tc>
-          <w:tcPr>
-            <w:tcW w:w="6300" w:type="dxa"/>
-            <w:shd w:val="clear" w:color="auto" w:fill="F5F5F5"/>
+          </w:p>
+        </w:tc>
+        <w:tc>
+          <w:tcPr>
+            <w:tcW w:w="6300" w:type="dxa"/>
           </w:tcPr>
           <w:p>
             <w:r>
@@ -2177,6 +2237,38 @@
         <w:t xml:space="preserve">uid:</w:t>
       </w:r>
       <w:r>
+        <w:t xml:space="preserve"> supplied) or remap UIDs (if </w:t>
+      </w:r>
+      <w:r>
+        <w:rPr>
+          <w:rFonts w:ascii="Courier New" w:hAnsi="Courier New"/>
+          <w:sz w:val="18"/>
+          <w:szCs w:val="18"/>
+          <w:shd w:val="clear" w:color="auto" w:fill="EBEBEB"/>
+        </w:rPr>
+        <w:t xml:space="preserve">remapuids:true</w:t>
+      </w:r>
+      <w:r>
+        <w:t xml:space="preserve">)</w:t>
+      </w:r>
+    </w:p>
+    <w:p>
+      <w:pPr>
+        <w:pStyle w:val="ListBullet"/>
+      </w:pPr>
+      <w:r>
+        <w:t xml:space="preserve">9. Apply row mask (if </w:t>
+      </w:r>
+      <w:r>
+        <w:rPr>
+          <w:rFonts w:ascii="Courier New" w:hAnsi="Courier New"/>
+          <w:sz w:val="18"/>
+          <w:szCs w:val="18"/>
+          <w:shd w:val="clear" w:color="auto" w:fill="EBEBEB"/>
+        </w:rPr>
+        <w:t xml:space="preserve">maskrows:</w:t>
+      </w:r>
+      <w:r>
         <w:t xml:space="preserve"> supplied)</w:t>
       </w:r>
     </w:p>
@@ -2185,19 +2277,19 @@
         <w:pStyle w:val="ListBullet"/>
       </w:pPr>
       <w:r>
-        <w:t xml:space="preserve">9. Apply row mask (if </w:t>
-      </w:r>
-      <w:r>
-        <w:rPr>
-          <w:rFonts w:ascii="Courier New" w:hAnsi="Courier New"/>
-          <w:sz w:val="18"/>
-          <w:szCs w:val="18"/>
-          <w:shd w:val="clear" w:color="auto" w:fill="EBEBEB"/>
-        </w:rPr>
-        <w:t xml:space="preserve">maskrows:</w:t>
-      </w:r>
-      <w:r>
-        <w:t xml:space="preserve"> supplied)</w:t>
+        <w:t xml:space="preserve">10. Apply all </w:t>
+      </w:r>
+      <w:r>
+        <w:rPr>
+          <w:rFonts w:ascii="Courier New" w:hAnsi="Courier New"/>
+          <w:sz w:val="18"/>
+          <w:szCs w:val="18"/>
+          <w:shd w:val="clear" w:color="auto" w:fill="EBEBEB"/>
+        </w:rPr>
+        <w:t xml:space="preserve">set:</w:t>
+      </w:r>
+      <w:r>
+        <w:t xml:space="preserve"> edits</w:t>
       </w:r>
     </w:p>
     <w:p>
@@ -2205,26 +2297,6 @@
         <w:pStyle w:val="ListBullet"/>
       </w:pPr>
       <w:r>
-        <w:t xml:space="preserve">10. Apply all </w:t>
-      </w:r>
-      <w:r>
-        <w:rPr>
-          <w:rFonts w:ascii="Courier New" w:hAnsi="Courier New"/>
-          <w:sz w:val="18"/>
-          <w:szCs w:val="18"/>
-          <w:shd w:val="clear" w:color="auto" w:fill="EBEBEB"/>
-        </w:rPr>
-        <w:t xml:space="preserve">set:</w:t>
-      </w:r>
-      <w:r>
-        <w:t xml:space="preserve"> edits</w:t>
-      </w:r>
-    </w:p>
-    <w:p>
-      <w:pPr>
-        <w:pStyle w:val="ListBullet"/>
-      </w:pPr>
-      <w:r>
         <w:t xml:space="preserve">11. Write output file to directory, or to the ZIP archive if </w:t>
       </w:r>
       <w:r>
@@ -2331,6 +2403,30 @@
         <w:pStyle w:val="Code"/>
       </w:pPr>
       <w:r>
+        <w:t xml:space="preserve">dicomtool modify input:C:\study output:C:\deidentified</w:t>
+      </w:r>
+    </w:p>
+    <w:p>
+      <w:pPr>
+        <w:pStyle w:val="Code"/>
+      </w:pPr>
+      <w:r>
+        <w:t xml:space="preserve">    set:PatientName=ANON set:PatientID=ANON</w:t>
+      </w:r>
+    </w:p>
+    <w:p>
+      <w:pPr>
+        <w:pStyle w:val="Code"/>
+      </w:pPr>
+      <w:r>
+        <w:t xml:space="preserve">    noprivate:true remapuids:true</w:t>
+      </w:r>
+    </w:p>
+    <w:p>
+      <w:pPr>
+        <w:pStyle w:val="Code"/>
+      </w:pPr>
+      <w:r>
         <w:t xml:space="preserve">dicomtool modify input:C:\study output:C:\out\study.zip zip:true</w:t>
       </w:r>
     </w:p>
@@ -2743,7 +2839,7 @@
         <w:pStyle w:val="Code"/>
       </w:pPr>
       <w:r>
-        <w:t xml:space="preserve">    [dob:&lt;mask&gt;] [uid:&lt;suffix&gt;]</w:t>
+        <w:t xml:space="preserve">    [dob:&lt;mask&gt;] [uid:&lt;suffix&gt;] [remapuids:true]</w:t>
       </w:r>
     </w:p>
     <w:p>
@@ -4161,6 +4257,14 @@
         <w:pStyle w:val="Code"/>
       </w:pPr>
       <w:r>
+        <w:t xml:space="preserve">    "remapuids":      false,</w:t>
+      </w:r>
+    </w:p>
+    <w:p>
+      <w:pPr>
+        <w:pStyle w:val="Code"/>
+      </w:pPr>
+      <w:r>
         <w:t xml:space="preserve">    "noprivate":      true,</w:t>
       </w:r>
     </w:p>
@@ -9107,6 +9211,105 @@
       </w:tr>
     </w:tbl>
     <w:p/>
+    <w:p>
+      <w:r>
+        <w:t xml:space="preserve">The </w:t>
+      </w:r>
+      <w:r>
+        <w:rPr>
+          <w:rFonts w:ascii="Courier New" w:hAnsi="Courier New"/>
+          <w:sz w:val="18"/>
+          <w:szCs w:val="18"/>
+          <w:shd w:val="clear" w:color="auto" w:fill="EBEBEB"/>
+        </w:rPr>
+        <w:t xml:space="preserve">uid:&lt;suffix&gt;</w:t>
+      </w:r>
+      <w:r>
+        <w:t xml:space="preserve"> operation appends a numeric suffix to UIDs, leaving the original value embedded in the result. This is suitable for lightweight namespacing but is reversible and does not break linkage to the source.</w:t>
+      </w:r>
+    </w:p>
+    <w:p>
+      <w:r>
+        <w:t xml:space="preserve">For de-identification, </w:t>
+      </w:r>
+      <w:r>
+        <w:rPr>
+          <w:rFonts w:ascii="Courier New" w:hAnsi="Courier New"/>
+          <w:sz w:val="18"/>
+          <w:szCs w:val="18"/>
+          <w:shd w:val="clear" w:color="auto" w:fill="EBEBEB"/>
+        </w:rPr>
+        <w:t xml:space="preserve">remapuids:true</w:t>
+      </w:r>
+      <w:r>
+        <w:t xml:space="preserve"> instead replaces each UID with a freshly generated value. Remapping uses a single shared table for the entire run, so the same source UID always maps to the same new UID in every file. This preserves the study/series/instance hierarchy and every internal reference (for example </w:t>
+      </w:r>
+      <w:r>
+        <w:rPr>
+          <w:rFonts w:ascii="Courier New" w:hAnsi="Courier New"/>
+          <w:sz w:val="18"/>
+          <w:szCs w:val="18"/>
+          <w:shd w:val="clear" w:color="auto" w:fill="EBEBEB"/>
+        </w:rPr>
+        <w:t xml:space="preserve">ReferencedSOPInstanceUID</w:t>
+      </w:r>
+      <w:r>
+        <w:t xml:space="preserve"> values nested inside sequences continue to point at the correct, remapped instances) while severing any link back to the originating system. New UIDs use the ISO </w:t>
+      </w:r>
+      <w:r>
+        <w:rPr>
+          <w:rFonts w:ascii="Courier New" w:hAnsi="Courier New"/>
+          <w:sz w:val="18"/>
+          <w:szCs w:val="18"/>
+          <w:shd w:val="clear" w:color="auto" w:fill="EBEBEB"/>
+        </w:rPr>
+        <w:t xml:space="preserve">2.25</w:t>
+      </w:r>
+      <w:r>
+        <w:t xml:space="preserve"> UUID-derived root and are unique per run; re-running the command produces a different set of UIDs.</w:t>
+      </w:r>
+    </w:p>
+    <w:p>
+      <w:r>
+        <w:t xml:space="preserve">UIDs beginning with the DICOM standard root </w:t>
+      </w:r>
+      <w:r>
+        <w:rPr>
+          <w:rFonts w:ascii="Courier New" w:hAnsi="Courier New"/>
+          <w:sz w:val="18"/>
+          <w:szCs w:val="18"/>
+          <w:shd w:val="clear" w:color="auto" w:fill="EBEBEB"/>
+        </w:rPr>
+        <w:t xml:space="preserve">1.2.840.10008.</w:t>
+      </w:r>
+      <w:r>
+        <w:t xml:space="preserve"> (SOP Class UIDs, Transfer Syntax UIDs, and other well-known values), together with the Implementation Class UID (0002,0012), are never remapped because they identify the object type, encoding, and creating software rather than the patient or study. </w:t>
+      </w:r>
+      <w:r>
+        <w:rPr>
+          <w:rFonts w:ascii="Courier New" w:hAnsi="Courier New"/>
+          <w:sz w:val="18"/>
+          <w:szCs w:val="18"/>
+          <w:shd w:val="clear" w:color="auto" w:fill="EBEBEB"/>
+        </w:rPr>
+        <w:t xml:space="preserve">remapuids:true</w:t>
+      </w:r>
+      <w:r>
+        <w:t xml:space="preserve"> and </w:t>
+      </w:r>
+      <w:r>
+        <w:rPr>
+          <w:rFonts w:ascii="Courier New" w:hAnsi="Courier New"/>
+          <w:sz w:val="18"/>
+          <w:szCs w:val="18"/>
+          <w:shd w:val="clear" w:color="auto" w:fill="EBEBEB"/>
+        </w:rPr>
+        <w:t xml:space="preserve">uid:&lt;suffix&gt;</w:t>
+      </w:r>
+      <w:r>
+        <w:t xml:space="preserve"> cannot be used together.</w:t>
+      </w:r>
+    </w:p>
     <w:p>
       <w:pPr>
         <w:pStyle w:val="Heading2"/>

</xml_diff>

<commit_message>
Release v1.4.0: resilient batch processing and error log file
- Continue-on-error: a failing file is recorded and skipped instead of
  aborting the run; always prints the processed/failed summary; exits
  non-zero when any file failed (usage text suppressed on post-run failure)
- Add errorlog:txt|csv|json - write detailed per-file errors to ERROR.<ext>
  in the output root; without it, details print to the console
- Add cmd/errorlog.go and writeErrorLog tests (txt/csv/json)
- Update CHANGELOG, user manual (.md/.docx), version to 1.4.0

Co-Authored-By: Claude Opus 4.8 <noreply@anthropic.com>
</commit_message>
<xml_diff>
--- a/dicomtool-manual.docx
+++ b/dicomtool-manual.docx
@@ -30,7 +30,7 @@
         <w:pStyle w:val="DocSubtitle"/>
       </w:pPr>
       <w:r>
-        <w:t>Usage Manual  v1.3.1</w:t>
+        <w:t>Usage Manual  v1.4.0</w:t>
       </w:r>
     </w:p>
     <w:p>
@@ -2062,6 +2062,47 @@
                 <w:szCs w:val="18"/>
                 <w:shd w:val="clear" w:color="auto" w:fill="EBEBEB"/>
               </w:rPr>
+              <w:t xml:space="preserve">errorlog:txt|csv|json</w:t>
+            </w:r>
+          </w:p>
+        </w:tc>
+        <w:tc>
+          <w:tcPr>
+            <w:tcW w:w="6300" w:type="dxa"/>
+          </w:tcPr>
+          <w:p>
+            <w:r>
+              <w:t xml:space="preserve">When one or more files fail, write the detailed per-file error messages to an </w:t>
+            </w:r>
+            <w:r>
+              <w:rPr>
+                <w:rFonts w:ascii="Courier New" w:hAnsi="Courier New"/>
+                <w:sz w:val="18"/>
+                <w:szCs w:val="18"/>
+                <w:shd w:val="clear" w:color="auto" w:fill="EBEBEB"/>
+              </w:rPr>
+              <w:t xml:space="preserve">ERROR.&lt;ext&gt;</w:t>
+            </w:r>
+            <w:r>
+              <w:t xml:space="preserve"> file in the root of the output directory instead of the console, in the chosen format. Without this parameter, the details print to the console. See the Error Handling subsection.</w:t>
+            </w:r>
+          </w:p>
+        </w:tc>
+      </w:tr>
+      <w:tr>
+        <w:tc>
+          <w:tcPr>
+            <w:tcW w:w="2700" w:type="dxa"/>
+            <w:shd w:val="clear" w:color="auto" w:fill="F5F5F5"/>
+          </w:tcPr>
+          <w:p>
+            <w:r>
+              <w:rPr>
+                <w:rFonts w:ascii="Courier New" w:hAnsi="Courier New"/>
+                <w:sz w:val="18"/>
+                <w:szCs w:val="18"/>
+                <w:shd w:val="clear" w:color="auto" w:fill="EBEBEB"/>
+              </w:rPr>
               <w:t xml:space="preserve">verbose:true</w:t>
             </w:r>
           </w:p>
@@ -2069,6 +2110,7 @@
         <w:tc>
           <w:tcPr>
             <w:tcW w:w="6300" w:type="dxa"/>
+            <w:shd w:val="clear" w:color="auto" w:fill="F5F5F5"/>
           </w:tcPr>
           <w:p>
             <w:r>
@@ -2339,6 +2381,212 @@
         <w:pStyle w:val="Heading3"/>
       </w:pPr>
       <w:r>
+        <w:t>Error Handling</w:t>
+      </w:r>
+    </w:p>
+    <w:p>
+      <w:r>
+        <w:t xml:space="preserve">Processing is resilient: a file that cannot be read, parsed, or written is recorded as a failure and skipped, and the run continues with the remaining files. One bad file never aborts an entire batch.</w:t>
+      </w:r>
+    </w:p>
+    <w:p>
+      <w:r>
+        <w:t xml:space="preserve">On completion a summary is always printed in the form </w:t>
+      </w:r>
+      <w:r>
+        <w:rPr>
+          <w:rFonts w:ascii="Courier New" w:hAnsi="Courier New"/>
+          <w:sz w:val="18"/>
+          <w:szCs w:val="18"/>
+          <w:shd w:val="clear" w:color="auto" w:fill="EBEBEB"/>
+        </w:rPr>
+        <w:t xml:space="preserve">N file(s) processed, M file(s) failed</w:t>
+      </w:r>
+      <w:r>
+        <w:t xml:space="preserve"> (the failed clause appears only when at least one file failed). When any file fails, the command exits with a non-zero status so scripts and pipelines can detect partial failures.</w:t>
+      </w:r>
+    </w:p>
+    <w:p>
+      <w:r>
+        <w:t xml:space="preserve">The detailed per-file error messages are, by default, printed to the console after the summary. Supplying </w:t>
+      </w:r>
+      <w:r>
+        <w:rPr>
+          <w:rFonts w:ascii="Courier New" w:hAnsi="Courier New"/>
+          <w:sz w:val="18"/>
+          <w:szCs w:val="18"/>
+          <w:shd w:val="clear" w:color="auto" w:fill="EBEBEB"/>
+        </w:rPr>
+        <w:t xml:space="preserve">errorlog:&lt;format&gt;</w:t>
+      </w:r>
+      <w:r>
+        <w:t xml:space="preserve"> instead redirects them into a file named </w:t>
+      </w:r>
+      <w:r>
+        <w:rPr>
+          <w:rFonts w:ascii="Courier New" w:hAnsi="Courier New"/>
+          <w:sz w:val="18"/>
+          <w:szCs w:val="18"/>
+          <w:shd w:val="clear" w:color="auto" w:fill="EBEBEB"/>
+        </w:rPr>
+        <w:t xml:space="preserve">ERROR.&lt;ext&gt;</w:t>
+      </w:r>
+      <w:r>
+        <w:t xml:space="preserve"> written in the root of the output directory (for ZIP output, alongside the archive). The file is created only when at least one file failed. Three formats are supported:</w:t>
+      </w:r>
+    </w:p>
+    <w:p>
+      <w:pPr>
+        <w:pStyle w:val="ListBullet"/>
+      </w:pPr>
+      <w:r>
+        <w:rPr>
+          <w:rFonts w:ascii="Courier New" w:hAnsi="Courier New"/>
+          <w:sz w:val="18"/>
+          <w:szCs w:val="18"/>
+          <w:shd w:val="clear" w:color="auto" w:fill="EBEBEB"/>
+        </w:rPr>
+        <w:t xml:space="preserve">errorlog:txt</w:t>
+      </w:r>
+      <w:r>
+        <w:t xml:space="preserve"> — plain text: a </w:t>
+      </w:r>
+      <w:r>
+        <w:rPr>
+          <w:rFonts w:ascii="Courier New" w:hAnsi="Courier New"/>
+          <w:sz w:val="18"/>
+          <w:szCs w:val="18"/>
+          <w:shd w:val="clear" w:color="auto" w:fill="EBEBEB"/>
+        </w:rPr>
+        <w:t xml:space="preserve">processed</w:t>
+      </w:r>
+      <w:r>
+        <w:t xml:space="preserve">/</w:t>
+      </w:r>
+      <w:r>
+        <w:rPr>
+          <w:rFonts w:ascii="Courier New" w:hAnsi="Courier New"/>
+          <w:sz w:val="18"/>
+          <w:szCs w:val="18"/>
+          <w:shd w:val="clear" w:color="auto" w:fill="EBEBEB"/>
+        </w:rPr>
+        <w:t xml:space="preserve">failed</w:t>
+      </w:r>
+      <w:r>
+        <w:t xml:space="preserve"> header followed by one </w:t>
+      </w:r>
+      <w:r>
+        <w:rPr>
+          <w:rFonts w:ascii="Courier New" w:hAnsi="Courier New"/>
+          <w:sz w:val="18"/>
+          <w:szCs w:val="18"/>
+          <w:shd w:val="clear" w:color="auto" w:fill="EBEBEB"/>
+        </w:rPr>
+        <w:t xml:space="preserve">file: error</w:t>
+      </w:r>
+      <w:r>
+        <w:t xml:space="preserve"> line per failure.</w:t>
+      </w:r>
+    </w:p>
+    <w:p>
+      <w:pPr>
+        <w:pStyle w:val="ListBullet"/>
+      </w:pPr>
+      <w:r>
+        <w:rPr>
+          <w:rFonts w:ascii="Courier New" w:hAnsi="Courier New"/>
+          <w:sz w:val="18"/>
+          <w:szCs w:val="18"/>
+          <w:shd w:val="clear" w:color="auto" w:fill="EBEBEB"/>
+        </w:rPr>
+        <w:t xml:space="preserve">errorlog:csv</w:t>
+      </w:r>
+      <w:r>
+        <w:t xml:space="preserve"> — comma-separated values with a </w:t>
+      </w:r>
+      <w:r>
+        <w:rPr>
+          <w:rFonts w:ascii="Courier New" w:hAnsi="Courier New"/>
+          <w:sz w:val="18"/>
+          <w:szCs w:val="18"/>
+          <w:shd w:val="clear" w:color="auto" w:fill="EBEBEB"/>
+        </w:rPr>
+        <w:t xml:space="preserve">file,error</w:t>
+      </w:r>
+      <w:r>
+        <w:t xml:space="preserve"> header row, suitable for spreadsheets.</w:t>
+      </w:r>
+    </w:p>
+    <w:p>
+      <w:pPr>
+        <w:pStyle w:val="ListBullet"/>
+      </w:pPr>
+      <w:r>
+        <w:rPr>
+          <w:rFonts w:ascii="Courier New" w:hAnsi="Courier New"/>
+          <w:sz w:val="18"/>
+          <w:szCs w:val="18"/>
+          <w:shd w:val="clear" w:color="auto" w:fill="EBEBEB"/>
+        </w:rPr>
+        <w:t xml:space="preserve">errorlog:json</w:t>
+      </w:r>
+      <w:r>
+        <w:t xml:space="preserve"> — a machine-readable object with </w:t>
+      </w:r>
+      <w:r>
+        <w:rPr>
+          <w:rFonts w:ascii="Courier New" w:hAnsi="Courier New"/>
+          <w:sz w:val="18"/>
+          <w:szCs w:val="18"/>
+          <w:shd w:val="clear" w:color="auto" w:fill="EBEBEB"/>
+        </w:rPr>
+        <w:t xml:space="preserve">processed</w:t>
+      </w:r>
+      <w:r>
+        <w:t xml:space="preserve"> and </w:t>
+      </w:r>
+      <w:r>
+        <w:rPr>
+          <w:rFonts w:ascii="Courier New" w:hAnsi="Courier New"/>
+          <w:sz w:val="18"/>
+          <w:szCs w:val="18"/>
+          <w:shd w:val="clear" w:color="auto" w:fill="EBEBEB"/>
+        </w:rPr>
+        <w:t xml:space="preserve">failed</w:t>
+      </w:r>
+      <w:r>
+        <w:t xml:space="preserve"> counts and an </w:t>
+      </w:r>
+      <w:r>
+        <w:rPr>
+          <w:rFonts w:ascii="Courier New" w:hAnsi="Courier New"/>
+          <w:sz w:val="18"/>
+          <w:szCs w:val="18"/>
+          <w:shd w:val="clear" w:color="auto" w:fill="EBEBEB"/>
+        </w:rPr>
+        <w:t xml:space="preserve">errors</w:t>
+      </w:r>
+      <w:r>
+        <w:t xml:space="preserve"> array of </w:t>
+      </w:r>
+      <w:r>
+        <w:rPr>
+          <w:rFonts w:ascii="Courier New" w:hAnsi="Courier New"/>
+          <w:sz w:val="18"/>
+          <w:szCs w:val="18"/>
+          <w:shd w:val="clear" w:color="auto" w:fill="EBEBEB"/>
+        </w:rPr>
+        <w:t xml:space="preserve">{file, error}</w:t>
+      </w:r>
+      <w:r>
+        <w:t xml:space="preserve"> entries.</w:t>
+      </w:r>
+    </w:p>
+    <w:p>
+      <w:pPr>
+        <w:pStyle w:val="Heading3"/>
+      </w:pPr>
+      <w:r>
         <w:t>Examples</w:t>
       </w:r>
     </w:p>
@@ -2468,6 +2716,22 @@
       </w:pPr>
       <w:r>
         <w:t xml:space="preserve">    set:PatientName=ANON noprivate:true</w:t>
+      </w:r>
+    </w:p>
+    <w:p>
+      <w:pPr>
+        <w:pStyle w:val="Code"/>
+      </w:pPr>
+      <w:r>
+        <w:t xml:space="preserve">dicomtool modify input:C:\study output:C:\deidentified</w:t>
+      </w:r>
+    </w:p>
+    <w:p>
+      <w:pPr>
+        <w:pStyle w:val="Code"/>
+      </w:pPr>
+      <w:r>
+        <w:t xml:space="preserve">    profile:base-deident errorlog:json</w:t>
       </w:r>
     </w:p>
     <w:p>

</xml_diff>

<commit_message>
Release v1.4.1: default base-deident profile remaps UIDs
- Add remapuids:true to the built-in base-deident profile so original
  study/series/instance UIDs are not embedded in de-identified output
- Update manual (Appendix A.2 profile reproduction and description) and
  CHANGELOG; bump version to 1.4.1

Co-Authored-By: Claude Opus 4.8 <noreply@anthropic.com>
</commit_message>
<xml_diff>
--- a/dicomtool-manual.docx
+++ b/dicomtool-manual.docx
@@ -30,7 +30,7 @@
         <w:pStyle w:val="DocSubtitle"/>
       </w:pPr>
       <w:r>
-        <w:t>Usage Manual  v1.4.0</w:t>
+        <w:t>Usage Manual  v1.4.1</w:t>
       </w:r>
     </w:p>
     <w:p>
@@ -10769,7 +10769,7 @@
         <w:t xml:space="preserve">base-deident</w:t>
       </w:r>
       <w:r>
-        <w:t xml:space="preserve"> is a comprehensive de-identification baseline: it sets patient identity fields to anonymous values, masks the date of birth to year only, removes all private tags, corrects non-standard Value Representations, and removes over 130 tags commonly associated with identifying information.</w:t>
+        <w:t xml:space="preserve"> is a comprehensive de-identification baseline: it sets patient identity fields to anonymous values, masks the date of birth to year only, removes all private tags, corrects non-standard Value Representations, remaps every study/series/instance UID consistently, and removes over 130 tags commonly associated with identifying information.</w:t>
       </w:r>
     </w:p>
     <w:p>
@@ -11145,7 +11145,15 @@
         <w:pStyle w:val="Code"/>
       </w:pPr>
       <w:r>
-        <w:t xml:space="preserve">    "fixvr":     "correct"</w:t>
+        <w:t xml:space="preserve">    "fixvr":     "correct",</w:t>
+      </w:r>
+    </w:p>
+    <w:p>
+      <w:pPr>
+        <w:pStyle w:val="Code"/>
+      </w:pPr>
+      <w:r>
+        <w:t xml:space="preserve">    "remapuids": true</w:t>
       </w:r>
     </w:p>
     <w:p>

</xml_diff>

<commit_message>
Release v1.4.2: branded DOCX cover, header, and footer
- DOCX manual gets an IRAT-branded title page: logo above the title,
  generation date between subtitle and description, institutional address
  at the bottom, all centered horizontally and vertically
- Content pages get a running header (dicomtool left, Page: N right, rule
  beneath) and footer (NIH/NCI support line, rule above); numbering starts
  at 1 on the first content page, cover unnumbered with no header/footer
- Add DICOMHdr Logo.png as a required build asset for the cover
- build-release.sh now runs the documentation generator before compiling
- Update CHANGELOG and regenerate manuals; bump version to 1.4.2

Co-Authored-By: Claude Opus 4.8 <noreply@anthropic.com>
</commit_message>
<xml_diff>
--- a/dicomtool-manual.docx
+++ b/dicomtool-manual.docx
@@ -1,51 +1,158 @@
 
 <file path=word/document.xml><?xml version="1.0" encoding="utf-8"?>
-<w:document xmlns:w="http://schemas.openxmlformats.org/wordprocessingml/2006/main">
+<w:document xmlns:w="http://schemas.openxmlformats.org/wordprocessingml/2006/main" xmlns:r="http://schemas.openxmlformats.org/officeDocument/2006/relationships" xmlns:wp="http://schemas.openxmlformats.org/drawingml/2006/wordprocessingDrawing" xmlns:a="http://schemas.openxmlformats.org/drawingml/2006/main" xmlns:pic="http://schemas.openxmlformats.org/drawingml/2006/picture">
   <w:body>
     <w:p>
       <w:pPr>
-        <w:spacing w:after="0"/>
-      </w:pPr>
-    </w:p>
-    <w:p>
-      <w:pPr>
-        <w:spacing w:after="0"/>
-      </w:pPr>
-    </w:p>
-    <w:p>
-      <w:pPr>
-        <w:spacing w:after="0"/>
-      </w:pPr>
-    </w:p>
-    <w:p>
-      <w:pPr>
-        <w:pStyle w:val="DocTitle"/>
-      </w:pPr>
-      <w:r>
-        <w:t>dicomtool</w:t>
-      </w:r>
-    </w:p>
-    <w:p>
-      <w:pPr>
-        <w:pStyle w:val="DocSubtitle"/>
-      </w:pPr>
-      <w:r>
-        <w:t>Usage Manual  v1.4.1</w:t>
-      </w:r>
-    </w:p>
-    <w:p>
-      <w:pPr>
-        <w:spacing w:after="0"/>
-      </w:pPr>
-    </w:p>
-    <w:p>
+        <w:spacing w:before="0" w:after="240"/>
+        <w:jc w:val="center"/>
+      </w:pPr>
+      <w:r>
+        <w:drawing>
+          <wp:inline distT="0" distB="0" distL="0" distR="0">
+            <wp:extent cx="2286000" cy="2286000"/>
+            <wp:effectExtent l="0" t="0" r="0" b="0"/>
+            <wp:docPr id="1" name="Logo"/>
+            <wp:cNvGraphicFramePr>
+              <a:graphicFrameLocks noChangeAspect="1"/>
+            </wp:cNvGraphicFramePr>
+            <a:graphic>
+              <a:graphicData uri="http://schemas.openxmlformats.org/drawingml/2006/picture">
+                <pic:pic>
+                  <pic:nvPicPr>
+                    <pic:cNvPr id="0" name="logo.png"/>
+                    <pic:cNvPicPr/>
+                  </pic:nvPicPr>
+                  <pic:blipFill>
+                    <a:blip r:embed="rId6"/>
+                    <a:stretch>
+                      <a:fillRect/>
+                    </a:stretch>
+                  </pic:blipFill>
+                  <pic:spPr>
+                    <a:xfrm>
+                      <a:off x="0" y="0"/>
+                      <a:ext cx="2286000" cy="2286000"/>
+                    </a:xfrm>
+                    <a:prstGeom prst="rect">
+                      <a:avLst/>
+                    </a:prstGeom>
+                  </pic:spPr>
+                </pic:pic>
+              </a:graphicData>
+            </a:graphic>
+          </wp:inline>
+        </w:drawing>
+      </w:r>
+    </w:p>
+    <w:p>
+      <w:pPr>
+        <w:spacing w:before="0" w:after="120"/>
+        <w:jc w:val="center"/>
+      </w:pPr>
+      <w:r>
+        <w:rPr>
+          <w:b/>
+          <w:color w:val="2E74B5"/>
+          <w:sz w:val="72"/>
+          <w:szCs w:val="72"/>
+        </w:rPr>
+        <w:t xml:space="preserve">dicomtool</w:t>
+      </w:r>
+    </w:p>
+    <w:p>
+      <w:pPr>
+        <w:spacing w:before="0" w:after="240"/>
+        <w:jc w:val="center"/>
+      </w:pPr>
+      <w:r>
+        <w:rPr>
+          <w:color w:val="595959"/>
+          <w:sz w:val="32"/>
+          <w:szCs w:val="32"/>
+        </w:rPr>
+        <w:t xml:space="preserve">Usage Manual  v1.4.2</w:t>
+      </w:r>
+    </w:p>
+    <w:p>
+      <w:pPr>
+        <w:spacing w:before="0" w:after="240"/>
+        <w:jc w:val="center"/>
+      </w:pPr>
+      <w:r>
+        <w:rPr>
+          <w:color w:val="595959"/>
+          <w:sz w:val="24"/>
+          <w:szCs w:val="24"/>
+        </w:rPr>
+        <w:t xml:space="preserve">June 2, 2026</w:t>
+      </w:r>
+    </w:p>
+    <w:p>
+      <w:pPr>
+        <w:spacing w:before="0" w:after="480"/>
+        <w:jc w:val="center"/>
+      </w:pPr>
       <w:r>
         <w:t xml:space="preserve">A command-line utility for inspecting and modifying DICOM medical imaging files.</w:t>
       </w:r>
     </w:p>
     <w:p>
-      <w:r>
-        <w:br w:type="page"/>
+      <w:pPr>
+        <w:spacing w:before="0" w:after="0"/>
+        <w:jc w:val="center"/>
+        <w:sectPr>
+          <w:pgSz w:w="12240" w:h="15840"/>
+          <w:pgMar w:top="1440" w:right="1440" w:bottom="1440" w:left="1440" w:header="720" w:footer="720" w:gutter="0"/>
+          <w:vAlign w:val="center"/>
+        </w:sectPr>
+      </w:pPr>
+      <w:r>
+        <w:rPr>
+          <w:sz w:val="20"/>
+          <w:szCs w:val="20"/>
+        </w:rPr>
+        <w:t xml:space="preserve">Image Response Assessment Team (IRAT)</w:t>
+      </w:r>
+      <w:r>
+        <w:br/>
+      </w:r>
+      <w:r>
+        <w:rPr>
+          <w:sz w:val="20"/>
+          <w:szCs w:val="20"/>
+        </w:rPr>
+        <w:t xml:space="preserve">550 North Broadway, Suite 300</w:t>
+      </w:r>
+      <w:r>
+        <w:br/>
+      </w:r>
+      <w:r>
+        <w:rPr>
+          <w:sz w:val="20"/>
+          <w:szCs w:val="20"/>
+        </w:rPr>
+        <w:t xml:space="preserve">The Sidney Kimmel Comprehensive Cancer Center</w:t>
+      </w:r>
+      <w:r>
+        <w:br/>
+      </w:r>
+      <w:r>
+        <w:rPr>
+          <w:sz w:val="20"/>
+          <w:szCs w:val="20"/>
+        </w:rPr>
+        <w:t xml:space="preserve">The Johns Hopkins University School of Medicine</w:t>
+      </w:r>
+      <w:r>
+        <w:br/>
+      </w:r>
+      <w:r>
+        <w:rPr>
+          <w:sz w:val="20"/>
+          <w:szCs w:val="20"/>
+        </w:rPr>
+        <w:t xml:space="preserve">Baltimore, MD 21205</w:t>
       </w:r>
     </w:p>
     <w:p>
@@ -11455,11 +11562,69 @@
       </w:r>
     </w:p>
     <w:sectPr>
+      <w:headerReference w:type="default" r:id="rId4"/>
+      <w:footerReference w:type="default" r:id="rId5"/>
       <w:pgSz w:w="12240" w:h="15840"/>
       <w:pgMar w:top="1440" w:right="1440" w:bottom="1440" w:left="1440" w:header="720" w:footer="720" w:gutter="0"/>
+      <w:pgNumType w:start="1"/>
     </w:sectPr>
   </w:body>
 </w:document>
+</file>
+
+<file path=word/footer1.xml><?xml version="1.0" encoding="utf-8"?>
+<w:ftr xmlns:w="http://schemas.openxmlformats.org/wordprocessingml/2006/main">
+  <w:p>
+    <w:pPr>
+      <w:pBdr>
+        <w:top w:val="single" w:sz="6" w:space="1" w:color="auto"/>
+      </w:pBdr>
+      <w:spacing w:after="0"/>
+      <w:jc w:val="left"/>
+    </w:pPr>
+    <w:r>
+      <w:rPr>
+        <w:sz w:val="16"/>
+        <w:szCs w:val="16"/>
+      </w:rPr>
+      <w:t>The IRAT Lab is supported by the National Institutes of Health/The National Cancer Institute P30CA006973</w:t>
+    </w:r>
+  </w:p>
+</w:ftr>
+</file>
+
+<file path=word/header1.xml><?xml version="1.0" encoding="utf-8"?>
+<w:hdr xmlns:w="http://schemas.openxmlformats.org/wordprocessingml/2006/main">
+  <w:p>
+    <w:pPr>
+      <w:pBdr>
+        <w:bottom w:val="single" w:sz="6" w:space="1" w:color="auto"/>
+      </w:pBdr>
+      <w:tabs>
+        <w:tab w:val="right" w:pos="9360"/>
+      </w:tabs>
+      <w:spacing w:after="0"/>
+    </w:pPr>
+    <w:r>
+      <w:t>dicomtool</w:t>
+    </w:r>
+    <w:r>
+      <w:tab/>
+    </w:r>
+    <w:r>
+      <w:t xml:space="preserve">Page: </w:t>
+    </w:r>
+    <w:r>
+      <w:fldChar w:fldCharType="begin"/>
+    </w:r>
+    <w:r>
+      <w:instrText xml:space="preserve"> PAGE </w:instrText>
+    </w:r>
+    <w:r>
+      <w:fldChar w:fldCharType="end"/>
+    </w:r>
+  </w:p>
+</w:hdr>
 </file>
 
 <file path=word/numbering.xml><?xml version="1.0" encoding="utf-8"?>

</xml_diff>

<commit_message>
Release v1.4.3: reduced base-deident removal list
The base-deident profile no longer strips 30 group 0040 tags
(order-entry, requested-procedure, and Structured Report content
fields), bringing the default removal list to 103 tags.
</commit_message>
<xml_diff>
--- a/dicomtool-manual.docx
+++ b/dicomtool-manual.docx
@@ -71,7 +71,7 @@
           <w:sz w:val="32"/>
           <w:szCs w:val="32"/>
         </w:rPr>
-        <w:t xml:space="preserve">Usage Manual  v1.4.2</w:t>
+        <w:t xml:space="preserve">Usage Manual  v1.4.3</w:t>
       </w:r>
     </w:p>
     <w:p>
@@ -85,7 +85,7 @@
           <w:sz w:val="24"/>
           <w:szCs w:val="24"/>
         </w:rPr>
-        <w:t xml:space="preserve">June 2, 2026</w:t>
+        <w:t xml:space="preserve">July 16, 2026</w:t>
       </w:r>
     </w:p>
     <w:p>
@@ -10876,7 +10876,7 @@
         <w:t xml:space="preserve">base-deident</w:t>
       </w:r>
       <w:r>
-        <w:t xml:space="preserve"> is a comprehensive de-identification baseline: it sets patient identity fields to anonymous values, masks the date of birth to year only, removes all private tags, corrects non-standard Value Representations, remaps every study/series/instance UID consistently, and removes over 130 tags commonly associated with identifying information.</w:t>
+        <w:t xml:space="preserve"> is a comprehensive de-identification baseline: it sets patient identity fields to anonymous values, masks the date of birth to year only, removes all private tags, corrects non-standard Value Representations, remaps every study/series/instance UID consistently, and removes over 100 tags commonly associated with identifying information.</w:t>
       </w:r>
     </w:p>
     <w:p>
@@ -11061,54 +11061,6 @@
       </w:pPr>
       <w:r>
         <w:t xml:space="preserve">      "38,10",  "38,300", "38,400", "38,500", "38,4000",</w:t>
-      </w:r>
-    </w:p>
-    <w:p>
-      <w:pPr>
-        <w:pStyle w:val="Code"/>
-      </w:pPr>
-      <w:r>
-        <w:t xml:space="preserve">      "40,275", "40,1001","40,1002","40,1004","40,1005",</w:t>
-      </w:r>
-    </w:p>
-    <w:p>
-      <w:pPr>
-        <w:pStyle w:val="Code"/>
-      </w:pPr>
-      <w:r>
-        <w:t xml:space="preserve">      "40,2008","40,2009","40,2010","40,2011","40,2016",</w:t>
-      </w:r>
-    </w:p>
-    <w:p>
-      <w:pPr>
-        <w:pStyle w:val="Code"/>
-      </w:pPr>
-      <w:r>
-        <w:t xml:space="preserve">      "40,2017","40,2400","40,4006","40,4009","40,4010",</w:t>
-      </w:r>
-    </w:p>
-    <w:p>
-      <w:pPr>
-        <w:pStyle w:val="Code"/>
-      </w:pPr>
-      <w:r>
-        <w:t xml:space="preserve">      "40,4020","40,4021","40,A057","40,A060","40,A066",</w:t>
-      </w:r>
-    </w:p>
-    <w:p>
-      <w:pPr>
-        <w:pStyle w:val="Code"/>
-      </w:pPr>
-      <w:r>
-        <w:t xml:space="preserve">      "40,A067","40,A068","40,A070","40,A073","40,A075",</w:t>
-      </w:r>
-    </w:p>
-    <w:p>
-      <w:pPr>
-        <w:pStyle w:val="Code"/>
-      </w:pPr>
-      <w:r>
-        <w:t xml:space="preserve">      "40,A078","40,A123","40,A160","40,A730",</w:t>
       </w:r>
     </w:p>
     <w:p>

</xml_diff>

<commit_message>
Release v1.4.4: revert base-deident removal list, add base-deident-keep-order profile
Restores the 29 group 0040 tags dropped from base-deident in v1.4.3 --
some (VerifyingObserverName, SR PersonName/TextValue) can carry
identifying information, so the default should keep stripping them.
Workflows that need that content now use the new derived profile
base-deident-keep-order (base:base-deident + keep) instead.
</commit_message>
<xml_diff>
--- a/dicomtool-manual.docx
+++ b/dicomtool-manual.docx
@@ -71,7 +71,7 @@
           <w:sz w:val="32"/>
           <w:szCs w:val="32"/>
         </w:rPr>
-        <w:t xml:space="preserve">Usage Manual  v1.4.3</w:t>
+        <w:t xml:space="preserve">Usage Manual  v1.4.4</w:t>
       </w:r>
     </w:p>
     <w:p>
@@ -10864,7 +10864,7 @@
     </w:p>
     <w:p>
       <w:r>
-        <w:t xml:space="preserve">Defines one built-in profile. </w:t>
+        <w:t xml:space="preserve">Defines two built-in profiles. </w:t>
       </w:r>
       <w:r>
         <w:rPr>
@@ -10876,7 +10876,7 @@
         <w:t xml:space="preserve">base-deident</w:t>
       </w:r>
       <w:r>
-        <w:t xml:space="preserve"> is a comprehensive de-identification baseline: it sets patient identity fields to anonymous values, masks the date of birth to year only, removes all private tags, corrects non-standard Value Representations, remaps every study/series/instance UID consistently, and removes over 100 tags commonly associated with identifying information.</w:t>
+        <w:t xml:space="preserve"> is a comprehensive de-identification baseline: it sets patient identity fields to anonymous values, masks the date of birth to year only, removes all private tags, corrects non-standard Value Representations, remaps every study/series/instance UID consistently, and removes over 130 tags commonly associated with identifying information.</w:t>
       </w:r>
     </w:p>
     <w:p>
@@ -11068,6 +11068,54 @@
         <w:pStyle w:val="Code"/>
       </w:pPr>
       <w:r>
+        <w:t xml:space="preserve">      "40,275", "40,1001","40,1002","40,1004","40,1005",</w:t>
+      </w:r>
+    </w:p>
+    <w:p>
+      <w:pPr>
+        <w:pStyle w:val="Code"/>
+      </w:pPr>
+      <w:r>
+        <w:t xml:space="preserve">      "40,2008","40,2009","40,2010","40,2011","40,2016",</w:t>
+      </w:r>
+    </w:p>
+    <w:p>
+      <w:pPr>
+        <w:pStyle w:val="Code"/>
+      </w:pPr>
+      <w:r>
+        <w:t xml:space="preserve">      "40,2017","40,2400","40,4006","40,4009","40,4010",</w:t>
+      </w:r>
+    </w:p>
+    <w:p>
+      <w:pPr>
+        <w:pStyle w:val="Code"/>
+      </w:pPr>
+      <w:r>
+        <w:t xml:space="preserve">      "40,4020","40,4021","40,A057","40,A060","40,A066",</w:t>
+      </w:r>
+    </w:p>
+    <w:p>
+      <w:pPr>
+        <w:pStyle w:val="Code"/>
+      </w:pPr>
+      <w:r>
+        <w:t xml:space="preserve">      "40,A067","40,A068","40,A070","40,A073","40,A075",</w:t>
+      </w:r>
+    </w:p>
+    <w:p>
+      <w:pPr>
+        <w:pStyle w:val="Code"/>
+      </w:pPr>
+      <w:r>
+        <w:t xml:space="preserve">      "40,A078","40,A123","40,A160","40,A730",</w:t>
+      </w:r>
+    </w:p>
+    <w:p>
+      <w:pPr>
+        <w:pStyle w:val="Code"/>
+      </w:pPr>
+      <w:r>
         <w:t xml:space="preserve">      "50,10",</w:t>
       </w:r>
     </w:p>
@@ -11213,6 +11261,208 @@
       </w:pPr>
       <w:r>
         <w:t xml:space="preserve">    "remapuids": true</w:t>
+      </w:r>
+    </w:p>
+    <w:p>
+      <w:pPr>
+        <w:pStyle w:val="Code"/>
+      </w:pPr>
+      <w:r>
+        <w:t xml:space="preserve">  }</w:t>
+      </w:r>
+    </w:p>
+    <w:p>
+      <w:pPr>
+        <w:pStyle w:val="Code"/>
+      </w:pPr>
+      <w:r>
+        <w:t xml:space="preserve">}</w:t>
+      </w:r>
+    </w:p>
+    <w:p>
+      <w:r>
+        <w:rPr>
+          <w:rFonts w:ascii="Courier New" w:hAnsi="Courier New"/>
+          <w:sz w:val="18"/>
+          <w:szCs w:val="18"/>
+          <w:shd w:val="clear" w:color="auto" w:fill="EBEBEB"/>
+        </w:rPr>
+        <w:t xml:space="preserve">base-deident-keep-order</w:t>
+      </w:r>
+      <w:r>
+        <w:t xml:space="preserve"> derives from </w:t>
+      </w:r>
+      <w:r>
+        <w:rPr>
+          <w:rFonts w:ascii="Courier New" w:hAnsi="Courier New"/>
+          <w:sz w:val="18"/>
+          <w:szCs w:val="18"/>
+          <w:shd w:val="clear" w:color="auto" w:fill="EBEBEB"/>
+        </w:rPr>
+        <w:t xml:space="preserve">base-deident</w:t>
+      </w:r>
+      <w:r>
+        <w:t xml:space="preserve"> and uses </w:t>
+      </w:r>
+      <w:r>
+        <w:rPr>
+          <w:rFonts w:ascii="Courier New" w:hAnsi="Courier New"/>
+          <w:sz w:val="18"/>
+          <w:szCs w:val="18"/>
+          <w:shd w:val="clear" w:color="auto" w:fill="EBEBEB"/>
+        </w:rPr>
+        <w:t xml:space="preserve">keep</w:t>
+      </w:r>
+      <w:r>
+        <w:t xml:space="preserve"> to restore the 29 group </w:t>
+      </w:r>
+      <w:r>
+        <w:rPr>
+          <w:rFonts w:ascii="Courier New" w:hAnsi="Courier New"/>
+          <w:sz w:val="18"/>
+          <w:szCs w:val="18"/>
+          <w:shd w:val="clear" w:color="auto" w:fill="EBEBEB"/>
+        </w:rPr>
+        <w:t xml:space="preserve">0040</w:t>
+      </w:r>
+      <w:r>
+        <w:t xml:space="preserve"> order-entry, requested-procedure, and Structured Report content tags (e.g. </w:t>
+      </w:r>
+      <w:r>
+        <w:rPr>
+          <w:rFonts w:ascii="Courier New" w:hAnsi="Courier New"/>
+          <w:sz w:val="18"/>
+          <w:szCs w:val="18"/>
+          <w:shd w:val="clear" w:color="auto" w:fill="EBEBEB"/>
+        </w:rPr>
+        <w:t xml:space="preserve">RequestedProcedureID</w:t>
+      </w:r>
+      <w:r>
+        <w:t xml:space="preserve">, </w:t>
+      </w:r>
+      <w:r>
+        <w:rPr>
+          <w:rFonts w:ascii="Courier New" w:hAnsi="Courier New"/>
+          <w:sz w:val="18"/>
+          <w:szCs w:val="18"/>
+          <w:shd w:val="clear" w:color="auto" w:fill="EBEBEB"/>
+        </w:rPr>
+        <w:t xml:space="preserve">VerifyingObserverName</w:t>
+      </w:r>
+      <w:r>
+        <w:t xml:space="preserve">, SR </w:t>
+      </w:r>
+      <w:r>
+        <w:rPr>
+          <w:rFonts w:ascii="Courier New" w:hAnsi="Courier New"/>
+          <w:sz w:val="18"/>
+          <w:szCs w:val="18"/>
+          <w:shd w:val="clear" w:color="auto" w:fill="EBEBEB"/>
+        </w:rPr>
+        <w:t xml:space="preserve">PersonName</w:t>
+      </w:r>
+      <w:r>
+        <w:t xml:space="preserve">/</w:t>
+      </w:r>
+      <w:r>
+        <w:rPr>
+          <w:rFonts w:ascii="Courier New" w:hAnsi="Courier New"/>
+          <w:sz w:val="18"/>
+          <w:szCs w:val="18"/>
+          <w:shd w:val="clear" w:color="auto" w:fill="EBEBEB"/>
+        </w:rPr>
+        <w:t xml:space="preserve">TextValue</w:t>
+      </w:r>
+      <w:r>
+        <w:t xml:space="preserve">) that the base profile removes. Use it for workflows where that content is needed and is not itself considered identifying.</w:t>
+      </w:r>
+    </w:p>
+    <w:p>
+      <w:pPr>
+        <w:pStyle w:val="Code"/>
+      </w:pPr>
+      <w:r>
+        <w:t xml:space="preserve">{</w:t>
+      </w:r>
+    </w:p>
+    <w:p>
+      <w:pPr>
+        <w:pStyle w:val="Code"/>
+      </w:pPr>
+      <w:r>
+        <w:t xml:space="preserve">  "base-deident-keep-order": {</w:t>
+      </w:r>
+    </w:p>
+    <w:p>
+      <w:pPr>
+        <w:pStyle w:val="Code"/>
+      </w:pPr>
+      <w:r>
+        <w:t xml:space="preserve">    "base": "base-deident",</w:t>
+      </w:r>
+    </w:p>
+    <w:p>
+      <w:pPr>
+        <w:pStyle w:val="Code"/>
+      </w:pPr>
+      <w:r>
+        <w:t xml:space="preserve">    "keep": [</w:t>
+      </w:r>
+    </w:p>
+    <w:p>
+      <w:pPr>
+        <w:pStyle w:val="Code"/>
+      </w:pPr>
+      <w:r>
+        <w:t xml:space="preserve">      "40,275", "40,1001","40,1002","40,1004","40,1005",</w:t>
+      </w:r>
+    </w:p>
+    <w:p>
+      <w:pPr>
+        <w:pStyle w:val="Code"/>
+      </w:pPr>
+      <w:r>
+        <w:t xml:space="preserve">      "40,2008","40,2009","40,2010","40,2011","40,2016",</w:t>
+      </w:r>
+    </w:p>
+    <w:p>
+      <w:pPr>
+        <w:pStyle w:val="Code"/>
+      </w:pPr>
+      <w:r>
+        <w:t xml:space="preserve">      "40,2017","40,2400","40,4006","40,4009","40,4010",</w:t>
+      </w:r>
+    </w:p>
+    <w:p>
+      <w:pPr>
+        <w:pStyle w:val="Code"/>
+      </w:pPr>
+      <w:r>
+        <w:t xml:space="preserve">      "40,4020","40,4021","40,A057","40,A060","40,A066",</w:t>
+      </w:r>
+    </w:p>
+    <w:p>
+      <w:pPr>
+        <w:pStyle w:val="Code"/>
+      </w:pPr>
+      <w:r>
+        <w:t xml:space="preserve">      "40,A067","40,A068","40,A070","40,A073","40,A075",</w:t>
+      </w:r>
+    </w:p>
+    <w:p>
+      <w:pPr>
+        <w:pStyle w:val="Code"/>
+      </w:pPr>
+      <w:r>
+        <w:t xml:space="preserve">      "40,A078","40,A123","40,A160","40,A730"</w:t>
+      </w:r>
+    </w:p>
+    <w:p>
+      <w:pPr>
+        <w:pStyle w:val="Code"/>
+      </w:pPr>
+      <w:r>
+        <w:t xml:space="preserve">    ]</w:t>
       </w:r>
     </w:p>
     <w:p>

</xml_diff>